<commit_message>
docs(er): regenerar worksheets e cheat sheet para abordagem das 6 regras (parte 2)
Fase 5 dos 18 worksheets passa a ter a estrutura:
- Cardinalidade | Participação | Regra | Nº tabelas | Onde fica a FK
- Em vez dos Passos A-B-C-D (tentativa com dados, observação, decisão, regra)

Alteracoes:
- generate-er-worksheets.js: novas funcoes fase5RelBlock/fase5SolBlock com
  tabela de 5 colunas (cardinalidade, participacao, regra, nº tabelas, FK);
  novos dados de solucao para os 4 casos guiados
- worksheet-fase5-treino.docx: 10 cenarios reformulados — em vez de tabelas-
  tentativa pre-preenchidas, o aluno identifica a regra a partir da
  descricao da cardinalidade e participacao. Incluidos cenarios de Regras
  1 (Edicao/Cartaz) e 3 (Artista/Escola) alem de 4, 5 e 6
- generate-cheat-sheet.js: remover blocos "Metodo 4 Passos" e "Atalho
  Mental"; substituir por legenda dos simbolos (★, ?, chaves) e tabela das
  6 regras

Co-Authored-By: Claude Opus 4.6 <noreply@anthropic.com>
</commit_message>
<xml_diff>
--- a/docs/er/worksheets/cheat-sheet-er.docx
+++ b/docs/er/worksheets/cheat-sheet-er.docx
@@ -2427,21 +2427,7 @@
                 <w:sz w:val="18"/>
                 <w:szCs w:val="18"/>
               </w:rPr>
-              <w:t xml:space="preserve">  5. Fase 5 — Metodo dos 4 Passos</w:t>
-            </w:r>
-          </w:p>
-          <w:p>
-            <w:pPr>
-              <w:spacing w:after="40"/>
-            </w:pPr>
-            <w:r>
-              <w:rPr>
-                <w:i/>
-                <w:iCs/>
-                <w:sz w:val="13"/>
-                <w:szCs w:val="13"/>
-              </w:rPr>
-              <w:t xml:space="preserve">Para cada relacao, faca este exercicio mental:</w:t>
+              <w:t xml:space="preserve">  5. Legenda dos Simbolos (diagramas das regras)</w:t>
             </w:r>
           </w:p>
           <w:tbl>
@@ -2457,8 +2443,8 @@
               </w:tblBorders>
             </w:tblPr>
             <w:tblGrid>
-              <w:gridCol w:w="1000"/>
-              <w:gridCol w:w="5300"/>
+              <w:gridCol w:w="1400"/>
+              <w:gridCol w:w="4900"/>
             </w:tblGrid>
             <w:tr>
               <w:trPr>
@@ -2466,7 +2452,7 @@
               </w:trPr>
               <w:tc>
                 <w:tcPr>
-                  <w:tcW w:type="dxa" w:w="1000"/>
+                  <w:tcW w:type="dxa" w:w="1400"/>
                   <w:tcBorders>
                     <w:top w:val="single" w:color="666666" w:sz="4"/>
                     <w:left w:val="single" w:color="666666" w:sz="4"/>
@@ -2490,13 +2476,13 @@
                       <w:sz w:val="14"/>
                       <w:szCs w:val="14"/>
                     </w:rPr>
-                    <w:t xml:space="preserve">Passo</w:t>
-                  </w:r>
-                </w:p>
-              </w:tc>
-              <w:tc>
-                <w:tcPr>
-                  <w:tcW w:type="dxa" w:w="5300"/>
+                    <w:t xml:space="preserve">Simbolo</w:t>
+                  </w:r>
+                </w:p>
+              </w:tc>
+              <w:tc>
+                <w:tcPr>
+                  <w:tcW w:type="dxa" w:w="4900"/>
                   <w:tcBorders>
                     <w:top w:val="single" w:color="666666" w:sz="4"/>
                     <w:left w:val="single" w:color="666666" w:sz="4"/>
@@ -2520,7 +2506,7 @@
                       <w:sz w:val="14"/>
                       <w:szCs w:val="14"/>
                     </w:rPr>
-                    <w:t xml:space="preserve">O que faz</w:t>
+                    <w:t xml:space="preserve">Significado</w:t>
                   </w:r>
                 </w:p>
               </w:tc>
@@ -2528,59 +2514,59 @@
             <w:tr>
               <w:tc>
                 <w:tcPr>
-                  <w:tcW w:type="dxa" w:w="1000"/>
-                  <w:tcBorders>
-                    <w:top w:val="single" w:color="AAAAAA" w:sz="4"/>
-                    <w:left w:val="single" w:color="AAAAAA" w:sz="4"/>
-                    <w:bottom w:val="single" w:color="AAAAAA" w:sz="4"/>
-                    <w:right w:val="single" w:color="AAAAAA" w:sz="4"/>
-                  </w:tcBorders>
-                  <w:tcMar>
-                    <w:top w:type="dxa" w:w="40"/>
-                    <w:left w:type="dxa" w:w="60"/>
-                    <w:bottom w:type="dxa" w:w="40"/>
-                    <w:right w:type="dxa" w:w="60"/>
-                  </w:tcMar>
-                </w:tcPr>
-                <w:p>
-                  <w:pPr>
-                    <w:spacing w:after="0"/>
-                  </w:pPr>
-                  <w:r>
-                    <w:rPr>
-                      <w:sz w:val="13"/>
-                      <w:szCs w:val="13"/>
-                    </w:rPr>
-                    <w:t xml:space="preserve">A — Tentativa</w:t>
-                  </w:r>
-                </w:p>
-              </w:tc>
-              <w:tc>
-                <w:tcPr>
-                  <w:tcW w:type="dxa" w:w="5300"/>
-                  <w:tcBorders>
-                    <w:top w:val="single" w:color="AAAAAA" w:sz="4"/>
-                    <w:left w:val="single" w:color="AAAAAA" w:sz="4"/>
-                    <w:bottom w:val="single" w:color="AAAAAA" w:sz="4"/>
-                    <w:right w:val="single" w:color="AAAAAA" w:sz="4"/>
-                  </w:tcBorders>
-                  <w:tcMar>
-                    <w:top w:type="dxa" w:w="40"/>
-                    <w:left w:type="dxa" w:w="60"/>
-                    <w:bottom w:type="dxa" w:w="40"/>
-                    <w:right w:type="dxa" w:w="60"/>
-                  </w:tcMar>
-                </w:tcPr>
-                <w:p>
-                  <w:pPr>
-                    <w:spacing w:after="0"/>
-                  </w:pPr>
-                  <w:r>
-                    <w:rPr>
-                      <w:sz w:val="13"/>
-                      <w:szCs w:val="13"/>
-                    </w:rPr>
-                    <w:t xml:space="preserve">Meta a FK no lado mais natural. Escreva 3 linhas com dados reais.</w:t>
+                  <w:tcW w:type="dxa" w:w="1400"/>
+                  <w:tcBorders>
+                    <w:top w:val="single" w:color="AAAAAA" w:sz="4"/>
+                    <w:left w:val="single" w:color="AAAAAA" w:sz="4"/>
+                    <w:bottom w:val="single" w:color="AAAAAA" w:sz="4"/>
+                    <w:right w:val="single" w:color="AAAAAA" w:sz="4"/>
+                  </w:tcBorders>
+                  <w:tcMar>
+                    <w:top w:type="dxa" w:w="40"/>
+                    <w:left w:type="dxa" w:w="60"/>
+                    <w:bottom w:type="dxa" w:w="40"/>
+                    <w:right w:type="dxa" w:w="60"/>
+                  </w:tcMar>
+                </w:tcPr>
+                <w:p>
+                  <w:pPr>
+                    <w:spacing w:after="0"/>
+                  </w:pPr>
+                  <w:r>
+                    <w:rPr>
+                      <w:sz w:val="13"/>
+                      <w:szCs w:val="13"/>
+                    </w:rPr>
+                    <w:t xml:space="preserve">?</w:t>
+                  </w:r>
+                </w:p>
+              </w:tc>
+              <w:tc>
+                <w:tcPr>
+                  <w:tcW w:type="dxa" w:w="4900"/>
+                  <w:tcBorders>
+                    <w:top w:val="single" w:color="AAAAAA" w:sz="4"/>
+                    <w:left w:val="single" w:color="AAAAAA" w:sz="4"/>
+                    <w:bottom w:val="single" w:color="AAAAAA" w:sz="4"/>
+                    <w:right w:val="single" w:color="AAAAAA" w:sz="4"/>
+                  </w:tcBorders>
+                  <w:tcMar>
+                    <w:top w:type="dxa" w:w="40"/>
+                    <w:left w:type="dxa" w:w="60"/>
+                    <w:bottom w:type="dxa" w:w="40"/>
+                    <w:right w:type="dxa" w:w="60"/>
+                  </w:tcMar>
+                </w:tcPr>
+                <w:p>
+                  <w:pPr>
+                    <w:spacing w:after="0"/>
+                  </w:pPr>
+                  <w:r>
+                    <w:rPr>
+                      <w:sz w:val="13"/>
+                      <w:szCs w:val="13"/>
+                    </w:rPr>
+                    <w:t xml:space="preserve">Com ou sem participacao obrigatoria (indiferente)</w:t>
                   </w:r>
                 </w:p>
               </w:tc>
@@ -2588,59 +2574,59 @@
             <w:tr>
               <w:tc>
                 <w:tcPr>
-                  <w:tcW w:type="dxa" w:w="1000"/>
-                  <w:tcBorders>
-                    <w:top w:val="single" w:color="AAAAAA" w:sz="4"/>
-                    <w:left w:val="single" w:color="AAAAAA" w:sz="4"/>
-                    <w:bottom w:val="single" w:color="AAAAAA" w:sz="4"/>
-                    <w:right w:val="single" w:color="AAAAAA" w:sz="4"/>
-                  </w:tcBorders>
-                  <w:tcMar>
-                    <w:top w:type="dxa" w:w="40"/>
-                    <w:left w:type="dxa" w:w="60"/>
-                    <w:bottom w:type="dxa" w:w="40"/>
-                    <w:right w:type="dxa" w:w="60"/>
-                  </w:tcMar>
-                </w:tcPr>
-                <w:p>
-                  <w:pPr>
-                    <w:spacing w:after="0"/>
-                  </w:pPr>
-                  <w:r>
-                    <w:rPr>
-                      <w:sz w:val="13"/>
-                      <w:szCs w:val="13"/>
-                    </w:rPr>
-                    <w:t xml:space="preserve">B — Observacao</w:t>
-                  </w:r>
-                </w:p>
-              </w:tc>
-              <w:tc>
-                <w:tcPr>
-                  <w:tcW w:type="dxa" w:w="5300"/>
-                  <w:tcBorders>
-                    <w:top w:val="single" w:color="AAAAAA" w:sz="4"/>
-                    <w:left w:val="single" w:color="AAAAAA" w:sz="4"/>
-                    <w:bottom w:val="single" w:color="AAAAAA" w:sz="4"/>
-                    <w:right w:val="single" w:color="AAAAAA" w:sz="4"/>
-                  </w:tcBorders>
-                  <w:tcMar>
-                    <w:top w:type="dxa" w:w="40"/>
-                    <w:left w:type="dxa" w:w="60"/>
-                    <w:bottom w:type="dxa" w:w="40"/>
-                    <w:right w:type="dxa" w:w="60"/>
-                  </w:tcMar>
-                </w:tcPr>
-                <w:p>
-                  <w:pPr>
-                    <w:spacing w:after="0"/>
-                  </w:pPr>
-                  <w:r>
-                    <w:rPr>
-                      <w:sz w:val="13"/>
-                      <w:szCs w:val="13"/>
-                    </w:rPr>
-                    <w:t xml:space="preserve">Aparecem NULLs (celulas vazias)? Aparecem linhas repetidas?</w:t>
+                  <w:tcW w:type="dxa" w:w="1400"/>
+                  <w:tcBorders>
+                    <w:top w:val="single" w:color="AAAAAA" w:sz="4"/>
+                    <w:left w:val="single" w:color="AAAAAA" w:sz="4"/>
+                    <w:bottom w:val="single" w:color="AAAAAA" w:sz="4"/>
+                    <w:right w:val="single" w:color="AAAAAA" w:sz="4"/>
+                  </w:tcBorders>
+                  <w:tcMar>
+                    <w:top w:type="dxa" w:w="40"/>
+                    <w:left w:type="dxa" w:w="60"/>
+                    <w:bottom w:type="dxa" w:w="40"/>
+                    <w:right w:type="dxa" w:w="60"/>
+                  </w:tcMar>
+                </w:tcPr>
+                <w:p>
+                  <w:pPr>
+                    <w:spacing w:after="0"/>
+                  </w:pPr>
+                  <w:r>
+                    <w:rPr>
+                      <w:sz w:val="13"/>
+                      <w:szCs w:val="13"/>
+                    </w:rPr>
+                    <w:t xml:space="preserve">Chave preenchida</w:t>
+                  </w:r>
+                </w:p>
+              </w:tc>
+              <w:tc>
+                <w:tcPr>
+                  <w:tcW w:type="dxa" w:w="4900"/>
+                  <w:tcBorders>
+                    <w:top w:val="single" w:color="AAAAAA" w:sz="4"/>
+                    <w:left w:val="single" w:color="AAAAAA" w:sz="4"/>
+                    <w:bottom w:val="single" w:color="AAAAAA" w:sz="4"/>
+                    <w:right w:val="single" w:color="AAAAAA" w:sz="4"/>
+                  </w:tcBorders>
+                  <w:tcMar>
+                    <w:top w:type="dxa" w:w="40"/>
+                    <w:left w:type="dxa" w:w="60"/>
+                    <w:bottom w:type="dxa" w:w="40"/>
+                    <w:right w:type="dxa" w:w="60"/>
+                  </w:tcMar>
+                </w:tcPr>
+                <w:p>
+                  <w:pPr>
+                    <w:spacing w:after="0"/>
+                  </w:pPr>
+                  <w:r>
+                    <w:rPr>
+                      <w:sz w:val="13"/>
+                      <w:szCs w:val="13"/>
+                    </w:rPr>
+                    <w:t xml:space="preserve">Chave primaria (obrigatoria + exclusiva)</w:t>
                   </w:r>
                 </w:p>
               </w:tc>
@@ -2648,59 +2634,59 @@
             <w:tr>
               <w:tc>
                 <w:tcPr>
-                  <w:tcW w:type="dxa" w:w="1000"/>
-                  <w:tcBorders>
-                    <w:top w:val="single" w:color="AAAAAA" w:sz="4"/>
-                    <w:left w:val="single" w:color="AAAAAA" w:sz="4"/>
-                    <w:bottom w:val="single" w:color="AAAAAA" w:sz="4"/>
-                    <w:right w:val="single" w:color="AAAAAA" w:sz="4"/>
-                  </w:tcBorders>
-                  <w:tcMar>
-                    <w:top w:type="dxa" w:w="40"/>
-                    <w:left w:type="dxa" w:w="60"/>
-                    <w:bottom w:type="dxa" w:w="40"/>
-                    <w:right w:type="dxa" w:w="60"/>
-                  </w:tcMar>
-                </w:tcPr>
-                <w:p>
-                  <w:pPr>
-                    <w:spacing w:after="0"/>
-                  </w:pPr>
-                  <w:r>
-                    <w:rPr>
-                      <w:sz w:val="13"/>
-                      <w:szCs w:val="13"/>
-                    </w:rPr>
-                    <w:t xml:space="preserve">C — Decisao</w:t>
-                  </w:r>
-                </w:p>
-              </w:tc>
-              <w:tc>
-                <w:tcPr>
-                  <w:tcW w:type="dxa" w:w="5300"/>
-                  <w:tcBorders>
-                    <w:top w:val="single" w:color="AAAAAA" w:sz="4"/>
-                    <w:left w:val="single" w:color="AAAAAA" w:sz="4"/>
-                    <w:bottom w:val="single" w:color="AAAAAA" w:sz="4"/>
-                    <w:right w:val="single" w:color="AAAAAA" w:sz="4"/>
-                  </w:tcBorders>
-                  <w:tcMar>
-                    <w:top w:type="dxa" w:w="40"/>
-                    <w:left w:type="dxa" w:w="60"/>
-                    <w:bottom w:type="dxa" w:w="40"/>
-                    <w:right w:type="dxa" w:w="60"/>
-                  </w:tcMar>
-                </w:tcPr>
-                <w:p>
-                  <w:pPr>
-                    <w:spacing w:after="0"/>
-                  </w:pPr>
-                  <w:r>
-                    <w:rPr>
-                      <w:sz w:val="13"/>
-                      <w:szCs w:val="13"/>
-                    </w:rPr>
-                    <w:t xml:space="preserve">Tudo limpo → 2 tabelas. Com problemas → criar tabela associativa (3 tabelas).</w:t>
+                  <w:tcW w:type="dxa" w:w="1400"/>
+                  <w:tcBorders>
+                    <w:top w:val="single" w:color="AAAAAA" w:sz="4"/>
+                    <w:left w:val="single" w:color="AAAAAA" w:sz="4"/>
+                    <w:bottom w:val="single" w:color="AAAAAA" w:sz="4"/>
+                    <w:right w:val="single" w:color="AAAAAA" w:sz="4"/>
+                  </w:tcBorders>
+                  <w:tcMar>
+                    <w:top w:type="dxa" w:w="40"/>
+                    <w:left w:type="dxa" w:w="60"/>
+                    <w:bottom w:type="dxa" w:w="40"/>
+                    <w:right w:type="dxa" w:w="60"/>
+                  </w:tcMar>
+                </w:tcPr>
+                <w:p>
+                  <w:pPr>
+                    <w:spacing w:after="0"/>
+                  </w:pPr>
+                  <w:r>
+                    <w:rPr>
+                      <w:sz w:val="13"/>
+                      <w:szCs w:val="13"/>
+                    </w:rPr>
+                    <w:t xml:space="preserve">Chave a tracejado</w:t>
+                  </w:r>
+                </w:p>
+              </w:tc>
+              <w:tc>
+                <w:tcPr>
+                  <w:tcW w:type="dxa" w:w="4900"/>
+                  <w:tcBorders>
+                    <w:top w:val="single" w:color="AAAAAA" w:sz="4"/>
+                    <w:left w:val="single" w:color="AAAAAA" w:sz="4"/>
+                    <w:bottom w:val="single" w:color="AAAAAA" w:sz="4"/>
+                    <w:right w:val="single" w:color="AAAAAA" w:sz="4"/>
+                  </w:tcBorders>
+                  <w:tcMar>
+                    <w:top w:type="dxa" w:w="40"/>
+                    <w:left w:type="dxa" w:w="60"/>
+                    <w:bottom w:type="dxa" w:w="40"/>
+                    <w:right w:type="dxa" w:w="60"/>
+                  </w:tcMar>
+                </w:tcPr>
+                <w:p>
+                  <w:pPr>
+                    <w:spacing w:after="0"/>
+                  </w:pPr>
+                  <w:r>
+                    <w:rPr>
+                      <w:sz w:val="13"/>
+                      <w:szCs w:val="13"/>
+                    </w:rPr>
+                    <w:t xml:space="preserve">Chave estrangeira</w:t>
                   </w:r>
                 </w:p>
               </w:tc>
@@ -2708,59 +2694,119 @@
             <w:tr>
               <w:tc>
                 <w:tcPr>
-                  <w:tcW w:type="dxa" w:w="1000"/>
-                  <w:tcBorders>
-                    <w:top w:val="single" w:color="AAAAAA" w:sz="4"/>
-                    <w:left w:val="single" w:color="AAAAAA" w:sz="4"/>
-                    <w:bottom w:val="single" w:color="AAAAAA" w:sz="4"/>
-                    <w:right w:val="single" w:color="AAAAAA" w:sz="4"/>
-                  </w:tcBorders>
-                  <w:tcMar>
-                    <w:top w:type="dxa" w:w="40"/>
-                    <w:left w:type="dxa" w:w="60"/>
-                    <w:bottom w:type="dxa" w:w="40"/>
-                    <w:right w:type="dxa" w:w="60"/>
-                  </w:tcMar>
-                </w:tcPr>
-                <w:p>
-                  <w:pPr>
-                    <w:spacing w:after="0"/>
-                  </w:pPr>
-                  <w:r>
-                    <w:rPr>
-                      <w:sz w:val="13"/>
-                      <w:szCs w:val="13"/>
-                    </w:rPr>
-                    <w:t xml:space="preserve">D — Regra</w:t>
-                  </w:r>
-                </w:p>
-              </w:tc>
-              <w:tc>
-                <w:tcPr>
-                  <w:tcW w:type="dxa" w:w="5300"/>
-                  <w:tcBorders>
-                    <w:top w:val="single" w:color="AAAAAA" w:sz="4"/>
-                    <w:left w:val="single" w:color="AAAAAA" w:sz="4"/>
-                    <w:bottom w:val="single" w:color="AAAAAA" w:sz="4"/>
-                    <w:right w:val="single" w:color="AAAAAA" w:sz="4"/>
-                  </w:tcBorders>
-                  <w:tcMar>
-                    <w:top w:type="dxa" w:w="40"/>
-                    <w:left w:type="dxa" w:w="60"/>
-                    <w:bottom w:type="dxa" w:w="40"/>
-                    <w:right w:type="dxa" w:w="60"/>
-                  </w:tcMar>
-                </w:tcPr>
-                <w:p>
-                  <w:pPr>
-                    <w:spacing w:after="0"/>
-                  </w:pPr>
-                  <w:r>
-                    <w:rPr>
-                      <w:sz w:val="13"/>
-                      <w:szCs w:val="13"/>
-                    </w:rPr>
-                    <w:t xml:space="preserve">Nomeie a regra aplicada (4, 5 ou 6).</w:t>
+                  <w:tcW w:type="dxa" w:w="1400"/>
+                  <w:tcBorders>
+                    <w:top w:val="single" w:color="AAAAAA" w:sz="4"/>
+                    <w:left w:val="single" w:color="AAAAAA" w:sz="4"/>
+                    <w:bottom w:val="single" w:color="AAAAAA" w:sz="4"/>
+                    <w:right w:val="single" w:color="AAAAAA" w:sz="4"/>
+                  </w:tcBorders>
+                  <w:tcMar>
+                    <w:top w:type="dxa" w:w="40"/>
+                    <w:left w:type="dxa" w:w="60"/>
+                    <w:bottom w:type="dxa" w:w="40"/>
+                    <w:right w:type="dxa" w:w="60"/>
+                  </w:tcMar>
+                </w:tcPr>
+                <w:p>
+                  <w:pPr>
+                    <w:spacing w:after="0"/>
+                  </w:pPr>
+                  <w:r>
+                    <w:rPr>
+                      <w:sz w:val="13"/>
+                      <w:szCs w:val="13"/>
+                    </w:rPr>
+                    <w:t xml:space="preserve">★</w:t>
+                  </w:r>
+                </w:p>
+              </w:tc>
+              <w:tc>
+                <w:tcPr>
+                  <w:tcW w:type="dxa" w:w="4900"/>
+                  <w:tcBorders>
+                    <w:top w:val="single" w:color="AAAAAA" w:sz="4"/>
+                    <w:left w:val="single" w:color="AAAAAA" w:sz="4"/>
+                    <w:bottom w:val="single" w:color="AAAAAA" w:sz="4"/>
+                    <w:right w:val="single" w:color="AAAAAA" w:sz="4"/>
+                  </w:tcBorders>
+                  <w:tcMar>
+                    <w:top w:type="dxa" w:w="40"/>
+                    <w:left w:type="dxa" w:w="60"/>
+                    <w:bottom w:type="dxa" w:w="40"/>
+                    <w:right w:type="dxa" w:w="60"/>
+                  </w:tcMar>
+                </w:tcPr>
+                <w:p>
+                  <w:pPr>
+                    <w:spacing w:after="0"/>
+                  </w:pPr>
+                  <w:r>
+                    <w:rPr>
+                      <w:sz w:val="13"/>
+                      <w:szCs w:val="13"/>
+                    </w:rPr>
+                    <w:t xml:space="preserve">Obrigatoria</w:t>
+                  </w:r>
+                </w:p>
+              </w:tc>
+            </w:tr>
+            <w:tr>
+              <w:tc>
+                <w:tcPr>
+                  <w:tcW w:type="dxa" w:w="1400"/>
+                  <w:tcBorders>
+                    <w:top w:val="single" w:color="AAAAAA" w:sz="4"/>
+                    <w:left w:val="single" w:color="AAAAAA" w:sz="4"/>
+                    <w:bottom w:val="single" w:color="AAAAAA" w:sz="4"/>
+                    <w:right w:val="single" w:color="AAAAAA" w:sz="4"/>
+                  </w:tcBorders>
+                  <w:tcMar>
+                    <w:top w:type="dxa" w:w="40"/>
+                    <w:left w:type="dxa" w:w="60"/>
+                    <w:bottom w:type="dxa" w:w="40"/>
+                    <w:right w:type="dxa" w:w="60"/>
+                  </w:tcMar>
+                </w:tcPr>
+                <w:p>
+                  <w:pPr>
+                    <w:spacing w:after="0"/>
+                  </w:pPr>
+                  <w:r>
+                    <w:rPr>
+                      <w:sz w:val="13"/>
+                      <w:szCs w:val="13"/>
+                    </w:rPr>
+                    <w:t xml:space="preserve">★★</w:t>
+                  </w:r>
+                </w:p>
+              </w:tc>
+              <w:tc>
+                <w:tcPr>
+                  <w:tcW w:type="dxa" w:w="4900"/>
+                  <w:tcBorders>
+                    <w:top w:val="single" w:color="AAAAAA" w:sz="4"/>
+                    <w:left w:val="single" w:color="AAAAAA" w:sz="4"/>
+                    <w:bottom w:val="single" w:color="AAAAAA" w:sz="4"/>
+                    <w:right w:val="single" w:color="AAAAAA" w:sz="4"/>
+                  </w:tcBorders>
+                  <w:tcMar>
+                    <w:top w:type="dxa" w:w="40"/>
+                    <w:left w:type="dxa" w:w="60"/>
+                    <w:bottom w:type="dxa" w:w="40"/>
+                    <w:right w:type="dxa" w:w="60"/>
+                  </w:tcMar>
+                </w:tcPr>
+                <w:p>
+                  <w:pPr>
+                    <w:spacing w:after="0"/>
+                  </w:pPr>
+                  <w:r>
+                    <w:rPr>
+                      <w:sz w:val="13"/>
+                      <w:szCs w:val="13"/>
+                    </w:rPr>
+                    <w:t xml:space="preserve">Obrigatoria + Exclusiva (unica)</w:t>
                   </w:r>
                 </w:p>
               </w:tc>
@@ -2787,7 +2833,7 @@
                 <w:sz w:val="18"/>
                 <w:szCs w:val="18"/>
               </w:rPr>
-              <w:t xml:space="preserve">  6. Atalho Mental (o mais importante!)</w:t>
+              <w:t xml:space="preserve">  6. As 6 Regras de Construcao de uma BD</w:t>
             </w:r>
           </w:p>
           <w:tbl>
@@ -2803,9 +2849,11 @@
               </w:tblBorders>
             </w:tblPr>
             <w:tblGrid>
-              <w:gridCol w:w="2600"/>
-              <w:gridCol w:w="2800"/>
-              <w:gridCol w:w="900"/>
+              <w:gridCol w:w="300"/>
+              <w:gridCol w:w="1200"/>
+              <w:gridCol w:w="1900"/>
+              <w:gridCol w:w="800"/>
+              <w:gridCol w:w="2100"/>
             </w:tblGrid>
             <w:tr>
               <w:trPr>
@@ -2813,7 +2861,7 @@
               </w:trPr>
               <w:tc>
                 <w:tcPr>
-                  <w:tcW w:type="dxa" w:w="2600"/>
+                  <w:tcW w:type="dxa" w:w="300"/>
                   <w:tcBorders>
                     <w:top w:val="single" w:color="666666" w:sz="4"/>
                     <w:left w:val="single" w:color="666666" w:sz="4"/>
@@ -2837,13 +2885,13 @@
                       <w:sz w:val="14"/>
                       <w:szCs w:val="14"/>
                     </w:rPr>
-                    <w:t xml:space="preserve">O que ve na tentativa?</w:t>
-                  </w:r>
-                </w:p>
-              </w:tc>
-              <w:tc>
-                <w:tcPr>
-                  <w:tcW w:type="dxa" w:w="2800"/>
+                    <w:t xml:space="preserve">R</w:t>
+                  </w:r>
+                </w:p>
+              </w:tc>
+              <w:tc>
+                <w:tcPr>
+                  <w:tcW w:type="dxa" w:w="1200"/>
                   <w:tcBorders>
                     <w:top w:val="single" w:color="666666" w:sz="4"/>
                     <w:left w:val="single" w:color="666666" w:sz="4"/>
@@ -2867,13 +2915,13 @@
                       <w:sz w:val="14"/>
                       <w:szCs w:val="14"/>
                     </w:rPr>
-                    <w:t xml:space="preserve">O que faz?</w:t>
-                  </w:r>
-                </w:p>
-              </w:tc>
-              <w:tc>
-                <w:tcPr>
-                  <w:tcW w:type="dxa" w:w="900"/>
+                    <w:t xml:space="preserve">Cardinalidade</w:t>
+                  </w:r>
+                </w:p>
+              </w:tc>
+              <w:tc>
+                <w:tcPr>
+                  <w:tcW w:type="dxa" w:w="1900"/>
                   <w:tcBorders>
                     <w:top w:val="single" w:color="666666" w:sz="4"/>
                     <w:left w:val="single" w:color="666666" w:sz="4"/>
@@ -2897,7 +2945,67 @@
                       <w:sz w:val="14"/>
                       <w:szCs w:val="14"/>
                     </w:rPr>
-                    <w:t xml:space="preserve">Regra</w:t>
+                    <w:t xml:space="preserve">Participacao</w:t>
+                  </w:r>
+                </w:p>
+              </w:tc>
+              <w:tc>
+                <w:tcPr>
+                  <w:tcW w:type="dxa" w:w="800"/>
+                  <w:tcBorders>
+                    <w:top w:val="single" w:color="666666" w:sz="4"/>
+                    <w:left w:val="single" w:color="666666" w:sz="4"/>
+                    <w:bottom w:val="single" w:color="666666" w:sz="4"/>
+                    <w:right w:val="single" w:color="666666" w:sz="4"/>
+                  </w:tcBorders>
+                  <w:shd w:fill="1F3864" w:val="clear"/>
+                  <w:tcMar>
+                    <w:top w:type="dxa" w:w="40"/>
+                    <w:left w:type="dxa" w:w="60"/>
+                    <w:bottom w:type="dxa" w:w="40"/>
+                    <w:right w:type="dxa" w:w="60"/>
+                  </w:tcMar>
+                </w:tcPr>
+                <w:p>
+                  <w:r>
+                    <w:rPr>
+                      <w:b/>
+                      <w:bCs/>
+                      <w:color w:val="FFFFFF"/>
+                      <w:sz w:val="14"/>
+                      <w:szCs w:val="14"/>
+                    </w:rPr>
+                    <w:t xml:space="preserve">N.º Tab.</w:t>
+                  </w:r>
+                </w:p>
+              </w:tc>
+              <w:tc>
+                <w:tcPr>
+                  <w:tcW w:type="dxa" w:w="2100"/>
+                  <w:tcBorders>
+                    <w:top w:val="single" w:color="666666" w:sz="4"/>
+                    <w:left w:val="single" w:color="666666" w:sz="4"/>
+                    <w:bottom w:val="single" w:color="666666" w:sz="4"/>
+                    <w:right w:val="single" w:color="666666" w:sz="4"/>
+                  </w:tcBorders>
+                  <w:shd w:fill="1F3864" w:val="clear"/>
+                  <w:tcMar>
+                    <w:top w:type="dxa" w:w="40"/>
+                    <w:left w:type="dxa" w:w="60"/>
+                    <w:bottom w:type="dxa" w:w="40"/>
+                    <w:right w:type="dxa" w:w="60"/>
+                  </w:tcMar>
+                </w:tcPr>
+                <w:p>
+                  <w:r>
+                    <w:rPr>
+                      <w:b/>
+                      <w:bCs/>
+                      <w:color w:val="FFFFFF"/>
+                      <w:sz w:val="14"/>
+                      <w:szCs w:val="14"/>
+                    </w:rPr>
+                    <w:t xml:space="preserve">Onde fica a FK</w:t>
                   </w:r>
                 </w:p>
               </w:tc>
@@ -2905,89 +3013,146 @@
             <w:tr>
               <w:tc>
                 <w:tcPr>
-                  <w:tcW w:type="dxa" w:w="2600"/>
-                  <w:tcBorders>
-                    <w:top w:val="single" w:color="AAAAAA" w:sz="4"/>
-                    <w:left w:val="single" w:color="AAAAAA" w:sz="4"/>
-                    <w:bottom w:val="single" w:color="AAAAAA" w:sz="4"/>
-                    <w:right w:val="single" w:color="AAAAAA" w:sz="4"/>
-                  </w:tcBorders>
-                  <w:tcMar>
-                    <w:top w:type="dxa" w:w="40"/>
-                    <w:left w:type="dxa" w:w="60"/>
-                    <w:bottom w:type="dxa" w:w="40"/>
-                    <w:right w:type="dxa" w:w="60"/>
-                  </w:tcMar>
-                </w:tcPr>
-                <w:p>
-                  <w:pPr>
-                    <w:spacing w:after="0"/>
-                  </w:pPr>
-                  <w:r>
-                    <w:rPr>
-                      <w:sz w:val="13"/>
-                      <w:szCs w:val="13"/>
-                    </w:rPr>
-                    <w:t xml:space="preserve">Tudo limpo (sem NULLs nem repeticoes)</w:t>
-                  </w:r>
-                </w:p>
-              </w:tc>
-              <w:tc>
-                <w:tcPr>
-                  <w:tcW w:type="dxa" w:w="2800"/>
-                  <w:tcBorders>
-                    <w:top w:val="single" w:color="AAAAAA" w:sz="4"/>
-                    <w:left w:val="single" w:color="AAAAAA" w:sz="4"/>
-                    <w:bottom w:val="single" w:color="AAAAAA" w:sz="4"/>
-                    <w:right w:val="single" w:color="AAAAAA" w:sz="4"/>
-                  </w:tcBorders>
-                  <w:tcMar>
-                    <w:top w:type="dxa" w:w="40"/>
-                    <w:left w:type="dxa" w:w="60"/>
-                    <w:bottom w:type="dxa" w:w="40"/>
-                    <w:right w:type="dxa" w:w="60"/>
-                  </w:tcMar>
-                </w:tcPr>
-                <w:p>
-                  <w:pPr>
-                    <w:spacing w:after="0"/>
-                  </w:pPr>
-                  <w:r>
-                    <w:rPr>
-                      <w:sz w:val="13"/>
-                      <w:szCs w:val="13"/>
-                    </w:rPr>
-                    <w:t xml:space="preserve">Fica com 2 tabelas</w:t>
-                  </w:r>
-                </w:p>
-              </w:tc>
-              <w:tc>
-                <w:tcPr>
-                  <w:tcW w:type="dxa" w:w="900"/>
-                  <w:tcBorders>
-                    <w:top w:val="single" w:color="AAAAAA" w:sz="4"/>
-                    <w:left w:val="single" w:color="AAAAAA" w:sz="4"/>
-                    <w:bottom w:val="single" w:color="AAAAAA" w:sz="4"/>
-                    <w:right w:val="single" w:color="AAAAAA" w:sz="4"/>
-                  </w:tcBorders>
-                  <w:shd w:fill="DCE6F1" w:val="clear"/>
-                  <w:tcMar>
-                    <w:top w:type="dxa" w:w="40"/>
-                    <w:left w:type="dxa" w:w="60"/>
-                    <w:bottom w:type="dxa" w:w="40"/>
-                    <w:right w:type="dxa" w:w="60"/>
-                  </w:tcMar>
-                </w:tcPr>
-                <w:p>
-                  <w:pPr>
-                    <w:spacing w:after="0"/>
-                  </w:pPr>
-                  <w:r>
-                    <w:rPr>
-                      <w:sz w:val="13"/>
-                      <w:szCs w:val="13"/>
-                    </w:rPr>
-                    <w:t xml:space="preserve">Regra 4</w:t>
+                  <w:tcW w:type="dxa" w:w="300"/>
+                  <w:tcBorders>
+                    <w:top w:val="single" w:color="AAAAAA" w:sz="4"/>
+                    <w:left w:val="single" w:color="AAAAAA" w:sz="4"/>
+                    <w:bottom w:val="single" w:color="AAAAAA" w:sz="4"/>
+                    <w:right w:val="single" w:color="AAAAAA" w:sz="4"/>
+                  </w:tcBorders>
+                  <w:tcMar>
+                    <w:top w:type="dxa" w:w="40"/>
+                    <w:left w:type="dxa" w:w="60"/>
+                    <w:bottom w:type="dxa" w:w="40"/>
+                    <w:right w:type="dxa" w:w="60"/>
+                  </w:tcMar>
+                </w:tcPr>
+                <w:p>
+                  <w:pPr>
+                    <w:spacing w:after="0"/>
+                  </w:pPr>
+                  <w:r>
+                    <w:rPr>
+                      <w:sz w:val="13"/>
+                      <w:szCs w:val="13"/>
+                    </w:rPr>
+                    <w:t xml:space="preserve">1</w:t>
+                  </w:r>
+                </w:p>
+              </w:tc>
+              <w:tc>
+                <w:tcPr>
+                  <w:tcW w:type="dxa" w:w="1200"/>
+                  <w:tcBorders>
+                    <w:top w:val="single" w:color="AAAAAA" w:sz="4"/>
+                    <w:left w:val="single" w:color="AAAAAA" w:sz="4"/>
+                    <w:bottom w:val="single" w:color="AAAAAA" w:sz="4"/>
+                    <w:right w:val="single" w:color="AAAAAA" w:sz="4"/>
+                  </w:tcBorders>
+                  <w:tcMar>
+                    <w:top w:type="dxa" w:w="40"/>
+                    <w:left w:type="dxa" w:w="60"/>
+                    <w:bottom w:type="dxa" w:w="40"/>
+                    <w:right w:type="dxa" w:w="60"/>
+                  </w:tcMar>
+                </w:tcPr>
+                <w:p>
+                  <w:pPr>
+                    <w:spacing w:after="0"/>
+                  </w:pPr>
+                  <w:r>
+                    <w:rPr>
+                      <w:sz w:val="13"/>
+                      <w:szCs w:val="13"/>
+                    </w:rPr>
+                    <w:t xml:space="preserve">1:1</w:t>
+                  </w:r>
+                </w:p>
+              </w:tc>
+              <w:tc>
+                <w:tcPr>
+                  <w:tcW w:type="dxa" w:w="1900"/>
+                  <w:tcBorders>
+                    <w:top w:val="single" w:color="AAAAAA" w:sz="4"/>
+                    <w:left w:val="single" w:color="AAAAAA" w:sz="4"/>
+                    <w:bottom w:val="single" w:color="AAAAAA" w:sz="4"/>
+                    <w:right w:val="single" w:color="AAAAAA" w:sz="4"/>
+                  </w:tcBorders>
+                  <w:tcMar>
+                    <w:top w:type="dxa" w:w="40"/>
+                    <w:left w:type="dxa" w:w="60"/>
+                    <w:bottom w:type="dxa" w:w="40"/>
+                    <w:right w:type="dxa" w:w="60"/>
+                  </w:tcMar>
+                </w:tcPr>
+                <w:p>
+                  <w:pPr>
+                    <w:spacing w:after="0"/>
+                  </w:pPr>
+                  <w:r>
+                    <w:rPr>
+                      <w:sz w:val="13"/>
+                      <w:szCs w:val="13"/>
+                    </w:rPr>
+                    <w:t xml:space="preserve">Obrig. em AMBAS</w:t>
+                  </w:r>
+                </w:p>
+              </w:tc>
+              <w:tc>
+                <w:tcPr>
+                  <w:tcW w:type="dxa" w:w="800"/>
+                  <w:tcBorders>
+                    <w:top w:val="single" w:color="AAAAAA" w:sz="4"/>
+                    <w:left w:val="single" w:color="AAAAAA" w:sz="4"/>
+                    <w:bottom w:val="single" w:color="AAAAAA" w:sz="4"/>
+                    <w:right w:val="single" w:color="AAAAAA" w:sz="4"/>
+                  </w:tcBorders>
+                  <w:tcMar>
+                    <w:top w:type="dxa" w:w="40"/>
+                    <w:left w:type="dxa" w:w="60"/>
+                    <w:bottom w:type="dxa" w:w="40"/>
+                    <w:right w:type="dxa" w:w="60"/>
+                  </w:tcMar>
+                </w:tcPr>
+                <w:p>
+                  <w:pPr>
+                    <w:spacing w:after="0"/>
+                  </w:pPr>
+                  <w:r>
+                    <w:rPr>
+                      <w:sz w:val="13"/>
+                      <w:szCs w:val="13"/>
+                    </w:rPr>
+                    <w:t xml:space="preserve">1</w:t>
+                  </w:r>
+                </w:p>
+              </w:tc>
+              <w:tc>
+                <w:tcPr>
+                  <w:tcW w:type="dxa" w:w="2100"/>
+                  <w:tcBorders>
+                    <w:top w:val="single" w:color="AAAAAA" w:sz="4"/>
+                    <w:left w:val="single" w:color="AAAAAA" w:sz="4"/>
+                    <w:bottom w:val="single" w:color="AAAAAA" w:sz="4"/>
+                    <w:right w:val="single" w:color="AAAAAA" w:sz="4"/>
+                  </w:tcBorders>
+                  <w:tcMar>
+                    <w:top w:type="dxa" w:w="40"/>
+                    <w:left w:type="dxa" w:w="60"/>
+                    <w:bottom w:type="dxa" w:w="40"/>
+                    <w:right w:type="dxa" w:w="60"/>
+                  </w:tcMar>
+                </w:tcPr>
+                <w:p>
+                  <w:pPr>
+                    <w:spacing w:after="0"/>
+                  </w:pPr>
+                  <w:r>
+                    <w:rPr>
+                      <w:sz w:val="13"/>
+                      <w:szCs w:val="13"/>
+                    </w:rPr>
+                    <w:t xml:space="preserve">PK de qualquer uma</w:t>
                   </w:r>
                 </w:p>
               </w:tc>
@@ -2995,89 +3160,146 @@
             <w:tr>
               <w:tc>
                 <w:tcPr>
-                  <w:tcW w:type="dxa" w:w="2600"/>
-                  <w:tcBorders>
-                    <w:top w:val="single" w:color="AAAAAA" w:sz="4"/>
-                    <w:left w:val="single" w:color="AAAAAA" w:sz="4"/>
-                    <w:bottom w:val="single" w:color="AAAAAA" w:sz="4"/>
-                    <w:right w:val="single" w:color="AAAAAA" w:sz="4"/>
-                  </w:tcBorders>
-                  <w:tcMar>
-                    <w:top w:type="dxa" w:w="40"/>
-                    <w:left w:type="dxa" w:w="60"/>
-                    <w:bottom w:type="dxa" w:w="40"/>
-                    <w:right w:type="dxa" w:w="60"/>
-                  </w:tcMar>
-                </w:tcPr>
-                <w:p>
-                  <w:pPr>
-                    <w:spacing w:after="0"/>
-                  </w:pPr>
-                  <w:r>
-                    <w:rPr>
-                      <w:sz w:val="13"/>
-                      <w:szCs w:val="13"/>
-                    </w:rPr>
-                    <w:t xml:space="preserve">Celulas vazias (NULLs)</w:t>
-                  </w:r>
-                </w:p>
-              </w:tc>
-              <w:tc>
-                <w:tcPr>
-                  <w:tcW w:type="dxa" w:w="2800"/>
-                  <w:tcBorders>
-                    <w:top w:val="single" w:color="AAAAAA" w:sz="4"/>
-                    <w:left w:val="single" w:color="AAAAAA" w:sz="4"/>
-                    <w:bottom w:val="single" w:color="AAAAAA" w:sz="4"/>
-                    <w:right w:val="single" w:color="AAAAAA" w:sz="4"/>
-                  </w:tcBorders>
-                  <w:tcMar>
-                    <w:top w:type="dxa" w:w="40"/>
-                    <w:left w:type="dxa" w:w="60"/>
-                    <w:bottom w:type="dxa" w:w="40"/>
-                    <w:right w:type="dxa" w:w="60"/>
-                  </w:tcMar>
-                </w:tcPr>
-                <w:p>
-                  <w:pPr>
-                    <w:spacing w:after="0"/>
-                  </w:pPr>
-                  <w:r>
-                    <w:rPr>
-                      <w:sz w:val="13"/>
-                      <w:szCs w:val="13"/>
-                    </w:rPr>
-                    <w:t xml:space="preserve">Cria 3a tabela associativa</w:t>
-                  </w:r>
-                </w:p>
-              </w:tc>
-              <w:tc>
-                <w:tcPr>
-                  <w:tcW w:type="dxa" w:w="900"/>
-                  <w:tcBorders>
-                    <w:top w:val="single" w:color="AAAAAA" w:sz="4"/>
-                    <w:left w:val="single" w:color="AAAAAA" w:sz="4"/>
-                    <w:bottom w:val="single" w:color="AAAAAA" w:sz="4"/>
-                    <w:right w:val="single" w:color="AAAAAA" w:sz="4"/>
-                  </w:tcBorders>
-                  <w:shd w:fill="DCE6F1" w:val="clear"/>
-                  <w:tcMar>
-                    <w:top w:type="dxa" w:w="40"/>
-                    <w:left w:type="dxa" w:w="60"/>
-                    <w:bottom w:type="dxa" w:w="40"/>
-                    <w:right w:type="dxa" w:w="60"/>
-                  </w:tcMar>
-                </w:tcPr>
-                <w:p>
-                  <w:pPr>
-                    <w:spacing w:after="0"/>
-                  </w:pPr>
-                  <w:r>
-                    <w:rPr>
-                      <w:sz w:val="13"/>
-                      <w:szCs w:val="13"/>
-                    </w:rPr>
-                    <w:t xml:space="preserve">Regra 5</w:t>
+                  <w:tcW w:type="dxa" w:w="300"/>
+                  <w:tcBorders>
+                    <w:top w:val="single" w:color="AAAAAA" w:sz="4"/>
+                    <w:left w:val="single" w:color="AAAAAA" w:sz="4"/>
+                    <w:bottom w:val="single" w:color="AAAAAA" w:sz="4"/>
+                    <w:right w:val="single" w:color="AAAAAA" w:sz="4"/>
+                  </w:tcBorders>
+                  <w:tcMar>
+                    <w:top w:type="dxa" w:w="40"/>
+                    <w:left w:type="dxa" w:w="60"/>
+                    <w:bottom w:type="dxa" w:w="40"/>
+                    <w:right w:type="dxa" w:w="60"/>
+                  </w:tcMar>
+                </w:tcPr>
+                <w:p>
+                  <w:pPr>
+                    <w:spacing w:after="0"/>
+                  </w:pPr>
+                  <w:r>
+                    <w:rPr>
+                      <w:sz w:val="13"/>
+                      <w:szCs w:val="13"/>
+                    </w:rPr>
+                    <w:t xml:space="preserve">2</w:t>
+                  </w:r>
+                </w:p>
+              </w:tc>
+              <w:tc>
+                <w:tcPr>
+                  <w:tcW w:type="dxa" w:w="1200"/>
+                  <w:tcBorders>
+                    <w:top w:val="single" w:color="AAAAAA" w:sz="4"/>
+                    <w:left w:val="single" w:color="AAAAAA" w:sz="4"/>
+                    <w:bottom w:val="single" w:color="AAAAAA" w:sz="4"/>
+                    <w:right w:val="single" w:color="AAAAAA" w:sz="4"/>
+                  </w:tcBorders>
+                  <w:tcMar>
+                    <w:top w:type="dxa" w:w="40"/>
+                    <w:left w:type="dxa" w:w="60"/>
+                    <w:bottom w:type="dxa" w:w="40"/>
+                    <w:right w:type="dxa" w:w="60"/>
+                  </w:tcMar>
+                </w:tcPr>
+                <w:p>
+                  <w:pPr>
+                    <w:spacing w:after="0"/>
+                  </w:pPr>
+                  <w:r>
+                    <w:rPr>
+                      <w:sz w:val="13"/>
+                      <w:szCs w:val="13"/>
+                    </w:rPr>
+                    <w:t xml:space="preserve">1:1</w:t>
+                  </w:r>
+                </w:p>
+              </w:tc>
+              <w:tc>
+                <w:tcPr>
+                  <w:tcW w:type="dxa" w:w="1900"/>
+                  <w:tcBorders>
+                    <w:top w:val="single" w:color="AAAAAA" w:sz="4"/>
+                    <w:left w:val="single" w:color="AAAAAA" w:sz="4"/>
+                    <w:bottom w:val="single" w:color="AAAAAA" w:sz="4"/>
+                    <w:right w:val="single" w:color="AAAAAA" w:sz="4"/>
+                  </w:tcBorders>
+                  <w:tcMar>
+                    <w:top w:type="dxa" w:w="40"/>
+                    <w:left w:type="dxa" w:w="60"/>
+                    <w:bottom w:type="dxa" w:w="40"/>
+                    <w:right w:type="dxa" w:w="60"/>
+                  </w:tcMar>
+                </w:tcPr>
+                <w:p>
+                  <w:pPr>
+                    <w:spacing w:after="0"/>
+                  </w:pPr>
+                  <w:r>
+                    <w:rPr>
+                      <w:sz w:val="13"/>
+                      <w:szCs w:val="13"/>
+                    </w:rPr>
+                    <w:t xml:space="preserve">Obrig. apenas numa</w:t>
+                  </w:r>
+                </w:p>
+              </w:tc>
+              <w:tc>
+                <w:tcPr>
+                  <w:tcW w:type="dxa" w:w="800"/>
+                  <w:tcBorders>
+                    <w:top w:val="single" w:color="AAAAAA" w:sz="4"/>
+                    <w:left w:val="single" w:color="AAAAAA" w:sz="4"/>
+                    <w:bottom w:val="single" w:color="AAAAAA" w:sz="4"/>
+                    <w:right w:val="single" w:color="AAAAAA" w:sz="4"/>
+                  </w:tcBorders>
+                  <w:tcMar>
+                    <w:top w:type="dxa" w:w="40"/>
+                    <w:left w:type="dxa" w:w="60"/>
+                    <w:bottom w:type="dxa" w:w="40"/>
+                    <w:right w:type="dxa" w:w="60"/>
+                  </w:tcMar>
+                </w:tcPr>
+                <w:p>
+                  <w:pPr>
+                    <w:spacing w:after="0"/>
+                  </w:pPr>
+                  <w:r>
+                    <w:rPr>
+                      <w:sz w:val="13"/>
+                      <w:szCs w:val="13"/>
+                    </w:rPr>
+                    <w:t xml:space="preserve">2</w:t>
+                  </w:r>
+                </w:p>
+              </w:tc>
+              <w:tc>
+                <w:tcPr>
+                  <w:tcW w:type="dxa" w:w="2100"/>
+                  <w:tcBorders>
+                    <w:top w:val="single" w:color="AAAAAA" w:sz="4"/>
+                    <w:left w:val="single" w:color="AAAAAA" w:sz="4"/>
+                    <w:bottom w:val="single" w:color="AAAAAA" w:sz="4"/>
+                    <w:right w:val="single" w:color="AAAAAA" w:sz="4"/>
+                  </w:tcBorders>
+                  <w:tcMar>
+                    <w:top w:type="dxa" w:w="40"/>
+                    <w:left w:type="dxa" w:w="60"/>
+                    <w:bottom w:type="dxa" w:w="40"/>
+                    <w:right w:type="dxa" w:w="60"/>
+                  </w:tcMar>
+                </w:tcPr>
+                <w:p>
+                  <w:pPr>
+                    <w:spacing w:after="0"/>
+                  </w:pPr>
+                  <w:r>
+                    <w:rPr>
+                      <w:sz w:val="13"/>
+                      <w:szCs w:val="13"/>
+                    </w:rPr>
+                    <w:t xml:space="preserve">PK nao-obrig. → FK na obrig.</w:t>
                   </w:r>
                 </w:p>
               </w:tc>
@@ -3085,94 +3307,607 @@
             <w:tr>
               <w:tc>
                 <w:tcPr>
-                  <w:tcW w:type="dxa" w:w="2600"/>
-                  <w:tcBorders>
-                    <w:top w:val="single" w:color="AAAAAA" w:sz="4"/>
-                    <w:left w:val="single" w:color="AAAAAA" w:sz="4"/>
-                    <w:bottom w:val="single" w:color="AAAAAA" w:sz="4"/>
-                    <w:right w:val="single" w:color="AAAAAA" w:sz="4"/>
-                  </w:tcBorders>
-                  <w:tcMar>
-                    <w:top w:type="dxa" w:w="40"/>
-                    <w:left w:type="dxa" w:w="60"/>
-                    <w:bottom w:type="dxa" w:w="40"/>
-                    <w:right w:type="dxa" w:w="60"/>
-                  </w:tcMar>
-                </w:tcPr>
-                <w:p>
-                  <w:pPr>
-                    <w:spacing w:after="0"/>
-                  </w:pPr>
-                  <w:r>
-                    <w:rPr>
-                      <w:sz w:val="13"/>
-                      <w:szCs w:val="13"/>
-                    </w:rPr>
-                    <w:t xml:space="preserve">Linhas repetidas</w:t>
-                  </w:r>
-                </w:p>
-              </w:tc>
-              <w:tc>
-                <w:tcPr>
-                  <w:tcW w:type="dxa" w:w="2800"/>
-                  <w:tcBorders>
-                    <w:top w:val="single" w:color="AAAAAA" w:sz="4"/>
-                    <w:left w:val="single" w:color="AAAAAA" w:sz="4"/>
-                    <w:bottom w:val="single" w:color="AAAAAA" w:sz="4"/>
-                    <w:right w:val="single" w:color="AAAAAA" w:sz="4"/>
-                  </w:tcBorders>
-                  <w:tcMar>
-                    <w:top w:type="dxa" w:w="40"/>
-                    <w:left w:type="dxa" w:w="60"/>
-                    <w:bottom w:type="dxa" w:w="40"/>
-                    <w:right w:type="dxa" w:w="60"/>
-                  </w:tcMar>
-                </w:tcPr>
-                <w:p>
-                  <w:pPr>
-                    <w:spacing w:after="0"/>
-                  </w:pPr>
-                  <w:r>
-                    <w:rPr>
-                      <w:sz w:val="13"/>
-                      <w:szCs w:val="13"/>
-                    </w:rPr>
-                    <w:t xml:space="preserve">Cria 3a tabela associativa</w:t>
-                  </w:r>
-                </w:p>
-              </w:tc>
-              <w:tc>
-                <w:tcPr>
-                  <w:tcW w:type="dxa" w:w="900"/>
-                  <w:tcBorders>
-                    <w:top w:val="single" w:color="AAAAAA" w:sz="4"/>
-                    <w:left w:val="single" w:color="AAAAAA" w:sz="4"/>
-                    <w:bottom w:val="single" w:color="AAAAAA" w:sz="4"/>
-                    <w:right w:val="single" w:color="AAAAAA" w:sz="4"/>
-                  </w:tcBorders>
-                  <w:shd w:fill="DCE6F1" w:val="clear"/>
-                  <w:tcMar>
-                    <w:top w:type="dxa" w:w="40"/>
-                    <w:left w:type="dxa" w:w="60"/>
-                    <w:bottom w:type="dxa" w:w="40"/>
-                    <w:right w:type="dxa" w:w="60"/>
-                  </w:tcMar>
-                </w:tcPr>
-                <w:p>
-                  <w:pPr>
-                    <w:spacing w:after="0"/>
-                  </w:pPr>
-                  <w:r>
-                    <w:rPr>
-                      <w:sz w:val="13"/>
-                      <w:szCs w:val="13"/>
-                    </w:rPr>
-                    <w:t xml:space="preserve">Regra 6</w:t>
+                  <w:tcW w:type="dxa" w:w="300"/>
+                  <w:tcBorders>
+                    <w:top w:val="single" w:color="AAAAAA" w:sz="4"/>
+                    <w:left w:val="single" w:color="AAAAAA" w:sz="4"/>
+                    <w:bottom w:val="single" w:color="AAAAAA" w:sz="4"/>
+                    <w:right w:val="single" w:color="AAAAAA" w:sz="4"/>
+                  </w:tcBorders>
+                  <w:tcMar>
+                    <w:top w:type="dxa" w:w="40"/>
+                    <w:left w:type="dxa" w:w="60"/>
+                    <w:bottom w:type="dxa" w:w="40"/>
+                    <w:right w:type="dxa" w:w="60"/>
+                  </w:tcMar>
+                </w:tcPr>
+                <w:p>
+                  <w:pPr>
+                    <w:spacing w:after="0"/>
+                  </w:pPr>
+                  <w:r>
+                    <w:rPr>
+                      <w:sz w:val="13"/>
+                      <w:szCs w:val="13"/>
+                    </w:rPr>
+                    <w:t xml:space="preserve">3</w:t>
+                  </w:r>
+                </w:p>
+              </w:tc>
+              <w:tc>
+                <w:tcPr>
+                  <w:tcW w:type="dxa" w:w="1200"/>
+                  <w:tcBorders>
+                    <w:top w:val="single" w:color="AAAAAA" w:sz="4"/>
+                    <w:left w:val="single" w:color="AAAAAA" w:sz="4"/>
+                    <w:bottom w:val="single" w:color="AAAAAA" w:sz="4"/>
+                    <w:right w:val="single" w:color="AAAAAA" w:sz="4"/>
+                  </w:tcBorders>
+                  <w:tcMar>
+                    <w:top w:type="dxa" w:w="40"/>
+                    <w:left w:type="dxa" w:w="60"/>
+                    <w:bottom w:type="dxa" w:w="40"/>
+                    <w:right w:type="dxa" w:w="60"/>
+                  </w:tcMar>
+                </w:tcPr>
+                <w:p>
+                  <w:pPr>
+                    <w:spacing w:after="0"/>
+                  </w:pPr>
+                  <w:r>
+                    <w:rPr>
+                      <w:sz w:val="13"/>
+                      <w:szCs w:val="13"/>
+                    </w:rPr>
+                    <w:t xml:space="preserve">1:1</w:t>
+                  </w:r>
+                </w:p>
+              </w:tc>
+              <w:tc>
+                <w:tcPr>
+                  <w:tcW w:type="dxa" w:w="1900"/>
+                  <w:tcBorders>
+                    <w:top w:val="single" w:color="AAAAAA" w:sz="4"/>
+                    <w:left w:val="single" w:color="AAAAAA" w:sz="4"/>
+                    <w:bottom w:val="single" w:color="AAAAAA" w:sz="4"/>
+                    <w:right w:val="single" w:color="AAAAAA" w:sz="4"/>
+                  </w:tcBorders>
+                  <w:tcMar>
+                    <w:top w:type="dxa" w:w="40"/>
+                    <w:left w:type="dxa" w:w="60"/>
+                    <w:bottom w:type="dxa" w:w="40"/>
+                    <w:right w:type="dxa" w:w="60"/>
+                  </w:tcMar>
+                </w:tcPr>
+                <w:p>
+                  <w:pPr>
+                    <w:spacing w:after="0"/>
+                  </w:pPr>
+                  <w:r>
+                    <w:rPr>
+                      <w:sz w:val="13"/>
+                      <w:szCs w:val="13"/>
+                    </w:rPr>
+                    <w:t xml:space="preserve">Nenhuma obrigatoria</w:t>
+                  </w:r>
+                </w:p>
+              </w:tc>
+              <w:tc>
+                <w:tcPr>
+                  <w:tcW w:type="dxa" w:w="800"/>
+                  <w:tcBorders>
+                    <w:top w:val="single" w:color="AAAAAA" w:sz="4"/>
+                    <w:left w:val="single" w:color="AAAAAA" w:sz="4"/>
+                    <w:bottom w:val="single" w:color="AAAAAA" w:sz="4"/>
+                    <w:right w:val="single" w:color="AAAAAA" w:sz="4"/>
+                  </w:tcBorders>
+                  <w:tcMar>
+                    <w:top w:type="dxa" w:w="40"/>
+                    <w:left w:type="dxa" w:w="60"/>
+                    <w:bottom w:type="dxa" w:w="40"/>
+                    <w:right w:type="dxa" w:w="60"/>
+                  </w:tcMar>
+                </w:tcPr>
+                <w:p>
+                  <w:pPr>
+                    <w:spacing w:after="0"/>
+                  </w:pPr>
+                  <w:r>
+                    <w:rPr>
+                      <w:sz w:val="13"/>
+                      <w:szCs w:val="13"/>
+                    </w:rPr>
+                    <w:t xml:space="preserve">3</w:t>
+                  </w:r>
+                </w:p>
+              </w:tc>
+              <w:tc>
+                <w:tcPr>
+                  <w:tcW w:type="dxa" w:w="2100"/>
+                  <w:tcBorders>
+                    <w:top w:val="single" w:color="AAAAAA" w:sz="4"/>
+                    <w:left w:val="single" w:color="AAAAAA" w:sz="4"/>
+                    <w:bottom w:val="single" w:color="AAAAAA" w:sz="4"/>
+                    <w:right w:val="single" w:color="AAAAAA" w:sz="4"/>
+                  </w:tcBorders>
+                  <w:tcMar>
+                    <w:top w:type="dxa" w:w="40"/>
+                    <w:left w:type="dxa" w:w="60"/>
+                    <w:bottom w:type="dxa" w:w="40"/>
+                    <w:right w:type="dxa" w:w="60"/>
+                  </w:tcMar>
+                </w:tcPr>
+                <w:p>
+                  <w:pPr>
+                    <w:spacing w:after="0"/>
+                  </w:pPr>
+                  <w:r>
+                    <w:rPr>
+                      <w:sz w:val="13"/>
+                      <w:szCs w:val="13"/>
+                    </w:rPr>
+                    <w:t xml:space="preserve">Tabela relacao c/ ambas PKs</w:t>
+                  </w:r>
+                </w:p>
+              </w:tc>
+            </w:tr>
+            <w:tr>
+              <w:tc>
+                <w:tcPr>
+                  <w:tcW w:type="dxa" w:w="300"/>
+                  <w:tcBorders>
+                    <w:top w:val="single" w:color="AAAAAA" w:sz="4"/>
+                    <w:left w:val="single" w:color="AAAAAA" w:sz="4"/>
+                    <w:bottom w:val="single" w:color="AAAAAA" w:sz="4"/>
+                    <w:right w:val="single" w:color="AAAAAA" w:sz="4"/>
+                  </w:tcBorders>
+                  <w:tcMar>
+                    <w:top w:type="dxa" w:w="40"/>
+                    <w:left w:type="dxa" w:w="60"/>
+                    <w:bottom w:type="dxa" w:w="40"/>
+                    <w:right w:type="dxa" w:w="60"/>
+                  </w:tcMar>
+                </w:tcPr>
+                <w:p>
+                  <w:pPr>
+                    <w:spacing w:after="0"/>
+                  </w:pPr>
+                  <w:r>
+                    <w:rPr>
+                      <w:sz w:val="13"/>
+                      <w:szCs w:val="13"/>
+                    </w:rPr>
+                    <w:t xml:space="preserve">4</w:t>
+                  </w:r>
+                </w:p>
+              </w:tc>
+              <w:tc>
+                <w:tcPr>
+                  <w:tcW w:type="dxa" w:w="1200"/>
+                  <w:tcBorders>
+                    <w:top w:val="single" w:color="AAAAAA" w:sz="4"/>
+                    <w:left w:val="single" w:color="AAAAAA" w:sz="4"/>
+                    <w:bottom w:val="single" w:color="AAAAAA" w:sz="4"/>
+                    <w:right w:val="single" w:color="AAAAAA" w:sz="4"/>
+                  </w:tcBorders>
+                  <w:tcMar>
+                    <w:top w:type="dxa" w:w="40"/>
+                    <w:left w:type="dxa" w:w="60"/>
+                    <w:bottom w:type="dxa" w:w="40"/>
+                    <w:right w:type="dxa" w:w="60"/>
+                  </w:tcMar>
+                </w:tcPr>
+                <w:p>
+                  <w:pPr>
+                    <w:spacing w:after="0"/>
+                  </w:pPr>
+                  <w:r>
+                    <w:rPr>
+                      <w:sz w:val="13"/>
+                      <w:szCs w:val="13"/>
+                    </w:rPr>
+                    <w:t xml:space="preserve">1:N</w:t>
+                  </w:r>
+                </w:p>
+              </w:tc>
+              <w:tc>
+                <w:tcPr>
+                  <w:tcW w:type="dxa" w:w="1900"/>
+                  <w:tcBorders>
+                    <w:top w:val="single" w:color="AAAAAA" w:sz="4"/>
+                    <w:left w:val="single" w:color="AAAAAA" w:sz="4"/>
+                    <w:bottom w:val="single" w:color="AAAAAA" w:sz="4"/>
+                    <w:right w:val="single" w:color="AAAAAA" w:sz="4"/>
+                  </w:tcBorders>
+                  <w:tcMar>
+                    <w:top w:type="dxa" w:w="40"/>
+                    <w:left w:type="dxa" w:w="60"/>
+                    <w:bottom w:type="dxa" w:w="40"/>
+                    <w:right w:type="dxa" w:w="60"/>
+                  </w:tcMar>
+                </w:tcPr>
+                <w:p>
+                  <w:pPr>
+                    <w:spacing w:after="0"/>
+                  </w:pPr>
+                  <w:r>
+                    <w:rPr>
+                      <w:sz w:val="13"/>
+                      <w:szCs w:val="13"/>
+                    </w:rPr>
+                    <w:t xml:space="preserve">Obrig. lado N</w:t>
+                  </w:r>
+                </w:p>
+              </w:tc>
+              <w:tc>
+                <w:tcPr>
+                  <w:tcW w:type="dxa" w:w="800"/>
+                  <w:tcBorders>
+                    <w:top w:val="single" w:color="AAAAAA" w:sz="4"/>
+                    <w:left w:val="single" w:color="AAAAAA" w:sz="4"/>
+                    <w:bottom w:val="single" w:color="AAAAAA" w:sz="4"/>
+                    <w:right w:val="single" w:color="AAAAAA" w:sz="4"/>
+                  </w:tcBorders>
+                  <w:tcMar>
+                    <w:top w:type="dxa" w:w="40"/>
+                    <w:left w:type="dxa" w:w="60"/>
+                    <w:bottom w:type="dxa" w:w="40"/>
+                    <w:right w:type="dxa" w:w="60"/>
+                  </w:tcMar>
+                </w:tcPr>
+                <w:p>
+                  <w:pPr>
+                    <w:spacing w:after="0"/>
+                  </w:pPr>
+                  <w:r>
+                    <w:rPr>
+                      <w:sz w:val="13"/>
+                      <w:szCs w:val="13"/>
+                    </w:rPr>
+                    <w:t xml:space="preserve">2</w:t>
+                  </w:r>
+                </w:p>
+              </w:tc>
+              <w:tc>
+                <w:tcPr>
+                  <w:tcW w:type="dxa" w:w="2100"/>
+                  <w:tcBorders>
+                    <w:top w:val="single" w:color="AAAAAA" w:sz="4"/>
+                    <w:left w:val="single" w:color="AAAAAA" w:sz="4"/>
+                    <w:bottom w:val="single" w:color="AAAAAA" w:sz="4"/>
+                    <w:right w:val="single" w:color="AAAAAA" w:sz="4"/>
+                  </w:tcBorders>
+                  <w:tcMar>
+                    <w:top w:type="dxa" w:w="40"/>
+                    <w:left w:type="dxa" w:w="60"/>
+                    <w:bottom w:type="dxa" w:w="40"/>
+                    <w:right w:type="dxa" w:w="60"/>
+                  </w:tcMar>
+                </w:tcPr>
+                <w:p>
+                  <w:pPr>
+                    <w:spacing w:after="0"/>
+                  </w:pPr>
+                  <w:r>
+                    <w:rPr>
+                      <w:sz w:val="13"/>
+                      <w:szCs w:val="13"/>
+                    </w:rPr>
+                    <w:t xml:space="preserve">PK do lado 1 → FK no lado N</w:t>
+                  </w:r>
+                </w:p>
+              </w:tc>
+            </w:tr>
+            <w:tr>
+              <w:tc>
+                <w:tcPr>
+                  <w:tcW w:type="dxa" w:w="300"/>
+                  <w:tcBorders>
+                    <w:top w:val="single" w:color="AAAAAA" w:sz="4"/>
+                    <w:left w:val="single" w:color="AAAAAA" w:sz="4"/>
+                    <w:bottom w:val="single" w:color="AAAAAA" w:sz="4"/>
+                    <w:right w:val="single" w:color="AAAAAA" w:sz="4"/>
+                  </w:tcBorders>
+                  <w:tcMar>
+                    <w:top w:type="dxa" w:w="40"/>
+                    <w:left w:type="dxa" w:w="60"/>
+                    <w:bottom w:type="dxa" w:w="40"/>
+                    <w:right w:type="dxa" w:w="60"/>
+                  </w:tcMar>
+                </w:tcPr>
+                <w:p>
+                  <w:pPr>
+                    <w:spacing w:after="0"/>
+                  </w:pPr>
+                  <w:r>
+                    <w:rPr>
+                      <w:sz w:val="13"/>
+                      <w:szCs w:val="13"/>
+                    </w:rPr>
+                    <w:t xml:space="preserve">5</w:t>
+                  </w:r>
+                </w:p>
+              </w:tc>
+              <w:tc>
+                <w:tcPr>
+                  <w:tcW w:type="dxa" w:w="1200"/>
+                  <w:tcBorders>
+                    <w:top w:val="single" w:color="AAAAAA" w:sz="4"/>
+                    <w:left w:val="single" w:color="AAAAAA" w:sz="4"/>
+                    <w:bottom w:val="single" w:color="AAAAAA" w:sz="4"/>
+                    <w:right w:val="single" w:color="AAAAAA" w:sz="4"/>
+                  </w:tcBorders>
+                  <w:tcMar>
+                    <w:top w:type="dxa" w:w="40"/>
+                    <w:left w:type="dxa" w:w="60"/>
+                    <w:bottom w:type="dxa" w:w="40"/>
+                    <w:right w:type="dxa" w:w="60"/>
+                  </w:tcMar>
+                </w:tcPr>
+                <w:p>
+                  <w:pPr>
+                    <w:spacing w:after="0"/>
+                  </w:pPr>
+                  <w:r>
+                    <w:rPr>
+                      <w:sz w:val="13"/>
+                      <w:szCs w:val="13"/>
+                    </w:rPr>
+                    <w:t xml:space="preserve">1:N</w:t>
+                  </w:r>
+                </w:p>
+              </w:tc>
+              <w:tc>
+                <w:tcPr>
+                  <w:tcW w:type="dxa" w:w="1900"/>
+                  <w:tcBorders>
+                    <w:top w:val="single" w:color="AAAAAA" w:sz="4"/>
+                    <w:left w:val="single" w:color="AAAAAA" w:sz="4"/>
+                    <w:bottom w:val="single" w:color="AAAAAA" w:sz="4"/>
+                    <w:right w:val="single" w:color="AAAAAA" w:sz="4"/>
+                  </w:tcBorders>
+                  <w:tcMar>
+                    <w:top w:type="dxa" w:w="40"/>
+                    <w:left w:type="dxa" w:w="60"/>
+                    <w:bottom w:type="dxa" w:w="40"/>
+                    <w:right w:type="dxa" w:w="60"/>
+                  </w:tcMar>
+                </w:tcPr>
+                <w:p>
+                  <w:pPr>
+                    <w:spacing w:after="0"/>
+                  </w:pPr>
+                  <w:r>
+                    <w:rPr>
+                      <w:sz w:val="13"/>
+                      <w:szCs w:val="13"/>
+                    </w:rPr>
+                    <w:t xml:space="preserve">NAO obrig. lado N</w:t>
+                  </w:r>
+                </w:p>
+              </w:tc>
+              <w:tc>
+                <w:tcPr>
+                  <w:tcW w:type="dxa" w:w="800"/>
+                  <w:tcBorders>
+                    <w:top w:val="single" w:color="AAAAAA" w:sz="4"/>
+                    <w:left w:val="single" w:color="AAAAAA" w:sz="4"/>
+                    <w:bottom w:val="single" w:color="AAAAAA" w:sz="4"/>
+                    <w:right w:val="single" w:color="AAAAAA" w:sz="4"/>
+                  </w:tcBorders>
+                  <w:tcMar>
+                    <w:top w:type="dxa" w:w="40"/>
+                    <w:left w:type="dxa" w:w="60"/>
+                    <w:bottom w:type="dxa" w:w="40"/>
+                    <w:right w:type="dxa" w:w="60"/>
+                  </w:tcMar>
+                </w:tcPr>
+                <w:p>
+                  <w:pPr>
+                    <w:spacing w:after="0"/>
+                  </w:pPr>
+                  <w:r>
+                    <w:rPr>
+                      <w:sz w:val="13"/>
+                      <w:szCs w:val="13"/>
+                    </w:rPr>
+                    <w:t xml:space="preserve">3</w:t>
+                  </w:r>
+                </w:p>
+              </w:tc>
+              <w:tc>
+                <w:tcPr>
+                  <w:tcW w:type="dxa" w:w="2100"/>
+                  <w:tcBorders>
+                    <w:top w:val="single" w:color="AAAAAA" w:sz="4"/>
+                    <w:left w:val="single" w:color="AAAAAA" w:sz="4"/>
+                    <w:bottom w:val="single" w:color="AAAAAA" w:sz="4"/>
+                    <w:right w:val="single" w:color="AAAAAA" w:sz="4"/>
+                  </w:tcBorders>
+                  <w:tcMar>
+                    <w:top w:type="dxa" w:w="40"/>
+                    <w:left w:type="dxa" w:w="60"/>
+                    <w:bottom w:type="dxa" w:w="40"/>
+                    <w:right w:type="dxa" w:w="60"/>
+                  </w:tcMar>
+                </w:tcPr>
+                <w:p>
+                  <w:pPr>
+                    <w:spacing w:after="0"/>
+                  </w:pPr>
+                  <w:r>
+                    <w:rPr>
+                      <w:sz w:val="13"/>
+                      <w:szCs w:val="13"/>
+                    </w:rPr>
+                    <w:t xml:space="preserve">Tabela relacao c/ ambas PKs</w:t>
+                  </w:r>
+                </w:p>
+              </w:tc>
+            </w:tr>
+            <w:tr>
+              <w:tc>
+                <w:tcPr>
+                  <w:tcW w:type="dxa" w:w="300"/>
+                  <w:tcBorders>
+                    <w:top w:val="single" w:color="AAAAAA" w:sz="4"/>
+                    <w:left w:val="single" w:color="AAAAAA" w:sz="4"/>
+                    <w:bottom w:val="single" w:color="AAAAAA" w:sz="4"/>
+                    <w:right w:val="single" w:color="AAAAAA" w:sz="4"/>
+                  </w:tcBorders>
+                  <w:tcMar>
+                    <w:top w:type="dxa" w:w="40"/>
+                    <w:left w:type="dxa" w:w="60"/>
+                    <w:bottom w:type="dxa" w:w="40"/>
+                    <w:right w:type="dxa" w:w="60"/>
+                  </w:tcMar>
+                </w:tcPr>
+                <w:p>
+                  <w:pPr>
+                    <w:spacing w:after="0"/>
+                  </w:pPr>
+                  <w:r>
+                    <w:rPr>
+                      <w:sz w:val="13"/>
+                      <w:szCs w:val="13"/>
+                    </w:rPr>
+                    <w:t xml:space="preserve">6</w:t>
+                  </w:r>
+                </w:p>
+              </w:tc>
+              <w:tc>
+                <w:tcPr>
+                  <w:tcW w:type="dxa" w:w="1200"/>
+                  <w:tcBorders>
+                    <w:top w:val="single" w:color="AAAAAA" w:sz="4"/>
+                    <w:left w:val="single" w:color="AAAAAA" w:sz="4"/>
+                    <w:bottom w:val="single" w:color="AAAAAA" w:sz="4"/>
+                    <w:right w:val="single" w:color="AAAAAA" w:sz="4"/>
+                  </w:tcBorders>
+                  <w:tcMar>
+                    <w:top w:type="dxa" w:w="40"/>
+                    <w:left w:type="dxa" w:w="60"/>
+                    <w:bottom w:type="dxa" w:w="40"/>
+                    <w:right w:type="dxa" w:w="60"/>
+                  </w:tcMar>
+                </w:tcPr>
+                <w:p>
+                  <w:pPr>
+                    <w:spacing w:after="0"/>
+                  </w:pPr>
+                  <w:r>
+                    <w:rPr>
+                      <w:sz w:val="13"/>
+                      <w:szCs w:val="13"/>
+                    </w:rPr>
+                    <w:t xml:space="preserve">N:M</w:t>
+                  </w:r>
+                </w:p>
+              </w:tc>
+              <w:tc>
+                <w:tcPr>
+                  <w:tcW w:type="dxa" w:w="1900"/>
+                  <w:tcBorders>
+                    <w:top w:val="single" w:color="AAAAAA" w:sz="4"/>
+                    <w:left w:val="single" w:color="AAAAAA" w:sz="4"/>
+                    <w:bottom w:val="single" w:color="AAAAAA" w:sz="4"/>
+                    <w:right w:val="single" w:color="AAAAAA" w:sz="4"/>
+                  </w:tcBorders>
+                  <w:tcMar>
+                    <w:top w:type="dxa" w:w="40"/>
+                    <w:left w:type="dxa" w:w="60"/>
+                    <w:bottom w:type="dxa" w:w="40"/>
+                    <w:right w:type="dxa" w:w="60"/>
+                  </w:tcMar>
+                </w:tcPr>
+                <w:p>
+                  <w:pPr>
+                    <w:spacing w:after="0"/>
+                  </w:pPr>
+                  <w:r>
+                    <w:rPr>
+                      <w:sz w:val="13"/>
+                      <w:szCs w:val="13"/>
+                    </w:rPr>
+                    <w:t xml:space="preserve">Indiferente</w:t>
+                  </w:r>
+                </w:p>
+              </w:tc>
+              <w:tc>
+                <w:tcPr>
+                  <w:tcW w:type="dxa" w:w="800"/>
+                  <w:tcBorders>
+                    <w:top w:val="single" w:color="AAAAAA" w:sz="4"/>
+                    <w:left w:val="single" w:color="AAAAAA" w:sz="4"/>
+                    <w:bottom w:val="single" w:color="AAAAAA" w:sz="4"/>
+                    <w:right w:val="single" w:color="AAAAAA" w:sz="4"/>
+                  </w:tcBorders>
+                  <w:tcMar>
+                    <w:top w:type="dxa" w:w="40"/>
+                    <w:left w:type="dxa" w:w="60"/>
+                    <w:bottom w:type="dxa" w:w="40"/>
+                    <w:right w:type="dxa" w:w="60"/>
+                  </w:tcMar>
+                </w:tcPr>
+                <w:p>
+                  <w:pPr>
+                    <w:spacing w:after="0"/>
+                  </w:pPr>
+                  <w:r>
+                    <w:rPr>
+                      <w:sz w:val="13"/>
+                      <w:szCs w:val="13"/>
+                    </w:rPr>
+                    <w:t xml:space="preserve">3</w:t>
+                  </w:r>
+                </w:p>
+              </w:tc>
+              <w:tc>
+                <w:tcPr>
+                  <w:tcW w:type="dxa" w:w="2100"/>
+                  <w:tcBorders>
+                    <w:top w:val="single" w:color="AAAAAA" w:sz="4"/>
+                    <w:left w:val="single" w:color="AAAAAA" w:sz="4"/>
+                    <w:bottom w:val="single" w:color="AAAAAA" w:sz="4"/>
+                    <w:right w:val="single" w:color="AAAAAA" w:sz="4"/>
+                  </w:tcBorders>
+                  <w:tcMar>
+                    <w:top w:type="dxa" w:w="40"/>
+                    <w:left w:type="dxa" w:w="60"/>
+                    <w:bottom w:type="dxa" w:w="40"/>
+                    <w:right w:type="dxa" w:w="60"/>
+                  </w:tcMar>
+                </w:tcPr>
+                <w:p>
+                  <w:pPr>
+                    <w:spacing w:after="0"/>
+                  </w:pPr>
+                  <w:r>
+                    <w:rPr>
+                      <w:sz w:val="13"/>
+                      <w:szCs w:val="13"/>
+                    </w:rPr>
+                    <w:t xml:space="preserve">Tabela relacao c/ ambas PKs</w:t>
                   </w:r>
                 </w:p>
               </w:tc>
             </w:tr>
           </w:tbl>
+          <w:p>
+            <w:pPr>
+              <w:spacing w:after="40" w:before="60"/>
+            </w:pPr>
+            <w:r>
+              <w:rPr>
+                <w:i/>
+                <w:iCs/>
+                <w:color w:val="1F3864"/>
+                <w:sz w:val="13"/>
+                <w:szCs w:val="13"/>
+              </w:rPr>
+              <w:t xml:space="preserve">Dica: 95% dos casos na AP sao Regra 4 (1:N obrig) ou Regra 6 (N:M).</w:t>
+            </w:r>
+          </w:p>
           <w:p>
             <w:pPr>
               <w:spacing w:after="80"/>
@@ -3194,1235 +3929,7 @@
                 <w:sz w:val="18"/>
                 <w:szCs w:val="18"/>
               </w:rPr>
-              <w:t xml:space="preserve">  7. Tabela Completa das 7 Regras</w:t>
-            </w:r>
-          </w:p>
-          <w:tbl>
-            <w:tblPr>
-              <w:tblW w:type="dxa" w:w="6300"/>
-              <w:tblBorders>
-                <w:top w:val="single" w:color="auto" w:sz="4"/>
-                <w:left w:val="single" w:color="auto" w:sz="4"/>
-                <w:bottom w:val="single" w:color="auto" w:sz="4"/>
-                <w:right w:val="single" w:color="auto" w:sz="4"/>
-                <w:insideH w:val="single" w:color="auto" w:sz="4"/>
-                <w:insideV w:val="single" w:color="auto" w:sz="4"/>
-              </w:tblBorders>
-            </w:tblPr>
-            <w:tblGrid>
-              <w:gridCol w:w="300"/>
-              <w:gridCol w:w="1200"/>
-              <w:gridCol w:w="1900"/>
-              <w:gridCol w:w="900"/>
-              <w:gridCol w:w="2000"/>
-            </w:tblGrid>
-            <w:tr>
-              <w:trPr>
-                <w:tblHeader/>
-              </w:trPr>
-              <w:tc>
-                <w:tcPr>
-                  <w:tcW w:type="dxa" w:w="300"/>
-                  <w:tcBorders>
-                    <w:top w:val="single" w:color="666666" w:sz="4"/>
-                    <w:left w:val="single" w:color="666666" w:sz="4"/>
-                    <w:bottom w:val="single" w:color="666666" w:sz="4"/>
-                    <w:right w:val="single" w:color="666666" w:sz="4"/>
-                  </w:tcBorders>
-                  <w:shd w:fill="1F3864" w:val="clear"/>
-                  <w:tcMar>
-                    <w:top w:type="dxa" w:w="40"/>
-                    <w:left w:type="dxa" w:w="60"/>
-                    <w:bottom w:type="dxa" w:w="40"/>
-                    <w:right w:type="dxa" w:w="60"/>
-                  </w:tcMar>
-                </w:tcPr>
-                <w:p>
-                  <w:r>
-                    <w:rPr>
-                      <w:b/>
-                      <w:bCs/>
-                      <w:color w:val="FFFFFF"/>
-                      <w:sz w:val="14"/>
-                      <w:szCs w:val="14"/>
-                    </w:rPr>
-                    <w:t xml:space="preserve">R</w:t>
-                  </w:r>
-                </w:p>
-              </w:tc>
-              <w:tc>
-                <w:tcPr>
-                  <w:tcW w:type="dxa" w:w="1200"/>
-                  <w:tcBorders>
-                    <w:top w:val="single" w:color="666666" w:sz="4"/>
-                    <w:left w:val="single" w:color="666666" w:sz="4"/>
-                    <w:bottom w:val="single" w:color="666666" w:sz="4"/>
-                    <w:right w:val="single" w:color="666666" w:sz="4"/>
-                  </w:tcBorders>
-                  <w:shd w:fill="1F3864" w:val="clear"/>
-                  <w:tcMar>
-                    <w:top w:type="dxa" w:w="40"/>
-                    <w:left w:type="dxa" w:w="60"/>
-                    <w:bottom w:type="dxa" w:w="40"/>
-                    <w:right w:type="dxa" w:w="60"/>
-                  </w:tcMar>
-                </w:tcPr>
-                <w:p>
-                  <w:r>
-                    <w:rPr>
-                      <w:b/>
-                      <w:bCs/>
-                      <w:color w:val="FFFFFF"/>
-                      <w:sz w:val="14"/>
-                      <w:szCs w:val="14"/>
-                    </w:rPr>
-                    <w:t xml:space="preserve">Cardinalidade</w:t>
-                  </w:r>
-                </w:p>
-              </w:tc>
-              <w:tc>
-                <w:tcPr>
-                  <w:tcW w:type="dxa" w:w="1900"/>
-                  <w:tcBorders>
-                    <w:top w:val="single" w:color="666666" w:sz="4"/>
-                    <w:left w:val="single" w:color="666666" w:sz="4"/>
-                    <w:bottom w:val="single" w:color="666666" w:sz="4"/>
-                    <w:right w:val="single" w:color="666666" w:sz="4"/>
-                  </w:tcBorders>
-                  <w:shd w:fill="1F3864" w:val="clear"/>
-                  <w:tcMar>
-                    <w:top w:type="dxa" w:w="40"/>
-                    <w:left w:type="dxa" w:w="60"/>
-                    <w:bottom w:type="dxa" w:w="40"/>
-                    <w:right w:type="dxa" w:w="60"/>
-                  </w:tcMar>
-                </w:tcPr>
-                <w:p>
-                  <w:r>
-                    <w:rPr>
-                      <w:b/>
-                      <w:bCs/>
-                      <w:color w:val="FFFFFF"/>
-                      <w:sz w:val="14"/>
-                      <w:szCs w:val="14"/>
-                    </w:rPr>
-                    <w:t xml:space="preserve">Participacao</w:t>
-                  </w:r>
-                </w:p>
-              </w:tc>
-              <w:tc>
-                <w:tcPr>
-                  <w:tcW w:type="dxa" w:w="900"/>
-                  <w:tcBorders>
-                    <w:top w:val="single" w:color="666666" w:sz="4"/>
-                    <w:left w:val="single" w:color="666666" w:sz="4"/>
-                    <w:bottom w:val="single" w:color="666666" w:sz="4"/>
-                    <w:right w:val="single" w:color="666666" w:sz="4"/>
-                  </w:tcBorders>
-                  <w:shd w:fill="1F3864" w:val="clear"/>
-                  <w:tcMar>
-                    <w:top w:type="dxa" w:w="40"/>
-                    <w:left w:type="dxa" w:w="60"/>
-                    <w:bottom w:type="dxa" w:w="40"/>
-                    <w:right w:type="dxa" w:w="60"/>
-                  </w:tcMar>
-                </w:tcPr>
-                <w:p>
-                  <w:r>
-                    <w:rPr>
-                      <w:b/>
-                      <w:bCs/>
-                      <w:color w:val="FFFFFF"/>
-                      <w:sz w:val="14"/>
-                      <w:szCs w:val="14"/>
-                    </w:rPr>
-                    <w:t xml:space="preserve">N.º Tabelas</w:t>
-                  </w:r>
-                </w:p>
-              </w:tc>
-              <w:tc>
-                <w:tcPr>
-                  <w:tcW w:type="dxa" w:w="2000"/>
-                  <w:tcBorders>
-                    <w:top w:val="single" w:color="666666" w:sz="4"/>
-                    <w:left w:val="single" w:color="666666" w:sz="4"/>
-                    <w:bottom w:val="single" w:color="666666" w:sz="4"/>
-                    <w:right w:val="single" w:color="666666" w:sz="4"/>
-                  </w:tcBorders>
-                  <w:shd w:fill="1F3864" w:val="clear"/>
-                  <w:tcMar>
-                    <w:top w:type="dxa" w:w="40"/>
-                    <w:left w:type="dxa" w:w="60"/>
-                    <w:bottom w:type="dxa" w:w="40"/>
-                    <w:right w:type="dxa" w:w="60"/>
-                  </w:tcMar>
-                </w:tcPr>
-                <w:p>
-                  <w:r>
-                    <w:rPr>
-                      <w:b/>
-                      <w:bCs/>
-                      <w:color w:val="FFFFFF"/>
-                      <w:sz w:val="14"/>
-                      <w:szCs w:val="14"/>
-                    </w:rPr>
-                    <w:t xml:space="preserve">Onde fica a FK</w:t>
-                  </w:r>
-                </w:p>
-              </w:tc>
-            </w:tr>
-            <w:tr>
-              <w:tc>
-                <w:tcPr>
-                  <w:tcW w:type="dxa" w:w="300"/>
-                  <w:tcBorders>
-                    <w:top w:val="single" w:color="AAAAAA" w:sz="4"/>
-                    <w:left w:val="single" w:color="AAAAAA" w:sz="4"/>
-                    <w:bottom w:val="single" w:color="AAAAAA" w:sz="4"/>
-                    <w:right w:val="single" w:color="AAAAAA" w:sz="4"/>
-                  </w:tcBorders>
-                  <w:tcMar>
-                    <w:top w:type="dxa" w:w="40"/>
-                    <w:left w:type="dxa" w:w="60"/>
-                    <w:bottom w:type="dxa" w:w="40"/>
-                    <w:right w:type="dxa" w:w="60"/>
-                  </w:tcMar>
-                </w:tcPr>
-                <w:p>
-                  <w:pPr>
-                    <w:spacing w:after="0"/>
-                  </w:pPr>
-                  <w:r>
-                    <w:rPr>
-                      <w:sz w:val="13"/>
-                      <w:szCs w:val="13"/>
-                    </w:rPr>
-                    <w:t xml:space="preserve">1</w:t>
-                  </w:r>
-                </w:p>
-              </w:tc>
-              <w:tc>
-                <w:tcPr>
-                  <w:tcW w:type="dxa" w:w="1200"/>
-                  <w:tcBorders>
-                    <w:top w:val="single" w:color="AAAAAA" w:sz="4"/>
-                    <w:left w:val="single" w:color="AAAAAA" w:sz="4"/>
-                    <w:bottom w:val="single" w:color="AAAAAA" w:sz="4"/>
-                    <w:right w:val="single" w:color="AAAAAA" w:sz="4"/>
-                  </w:tcBorders>
-                  <w:tcMar>
-                    <w:top w:type="dxa" w:w="40"/>
-                    <w:left w:type="dxa" w:w="60"/>
-                    <w:bottom w:type="dxa" w:w="40"/>
-                    <w:right w:type="dxa" w:w="60"/>
-                  </w:tcMar>
-                </w:tcPr>
-                <w:p>
-                  <w:pPr>
-                    <w:spacing w:after="0"/>
-                  </w:pPr>
-                  <w:r>
-                    <w:rPr>
-                      <w:sz w:val="13"/>
-                      <w:szCs w:val="13"/>
-                    </w:rPr>
-                    <w:t xml:space="preserve">1:1</w:t>
-                  </w:r>
-                </w:p>
-              </w:tc>
-              <w:tc>
-                <w:tcPr>
-                  <w:tcW w:type="dxa" w:w="1900"/>
-                  <w:tcBorders>
-                    <w:top w:val="single" w:color="AAAAAA" w:sz="4"/>
-                    <w:left w:val="single" w:color="AAAAAA" w:sz="4"/>
-                    <w:bottom w:val="single" w:color="AAAAAA" w:sz="4"/>
-                    <w:right w:val="single" w:color="AAAAAA" w:sz="4"/>
-                  </w:tcBorders>
-                  <w:tcMar>
-                    <w:top w:type="dxa" w:w="40"/>
-                    <w:left w:type="dxa" w:w="60"/>
-                    <w:bottom w:type="dxa" w:w="40"/>
-                    <w:right w:type="dxa" w:w="60"/>
-                  </w:tcMar>
-                </w:tcPr>
-                <w:p>
-                  <w:pPr>
-                    <w:spacing w:after="0"/>
-                  </w:pPr>
-                  <w:r>
-                    <w:rPr>
-                      <w:sz w:val="13"/>
-                      <w:szCs w:val="13"/>
-                    </w:rPr>
-                    <w:t xml:space="preserve">Obrig. ambas</w:t>
-                  </w:r>
-                </w:p>
-              </w:tc>
-              <w:tc>
-                <w:tcPr>
-                  <w:tcW w:type="dxa" w:w="900"/>
-                  <w:tcBorders>
-                    <w:top w:val="single" w:color="AAAAAA" w:sz="4"/>
-                    <w:left w:val="single" w:color="AAAAAA" w:sz="4"/>
-                    <w:bottom w:val="single" w:color="AAAAAA" w:sz="4"/>
-                    <w:right w:val="single" w:color="AAAAAA" w:sz="4"/>
-                  </w:tcBorders>
-                  <w:tcMar>
-                    <w:top w:type="dxa" w:w="40"/>
-                    <w:left w:type="dxa" w:w="60"/>
-                    <w:bottom w:type="dxa" w:w="40"/>
-                    <w:right w:type="dxa" w:w="60"/>
-                  </w:tcMar>
-                </w:tcPr>
-                <w:p>
-                  <w:pPr>
-                    <w:spacing w:after="0"/>
-                  </w:pPr>
-                  <w:r>
-                    <w:rPr>
-                      <w:sz w:val="13"/>
-                      <w:szCs w:val="13"/>
-                    </w:rPr>
-                    <w:t xml:space="preserve">1</w:t>
-                  </w:r>
-                </w:p>
-              </w:tc>
-              <w:tc>
-                <w:tcPr>
-                  <w:tcW w:type="dxa" w:w="2000"/>
-                  <w:tcBorders>
-                    <w:top w:val="single" w:color="AAAAAA" w:sz="4"/>
-                    <w:left w:val="single" w:color="AAAAAA" w:sz="4"/>
-                    <w:bottom w:val="single" w:color="AAAAAA" w:sz="4"/>
-                    <w:right w:val="single" w:color="AAAAAA" w:sz="4"/>
-                  </w:tcBorders>
-                  <w:tcMar>
-                    <w:top w:type="dxa" w:w="40"/>
-                    <w:left w:type="dxa" w:w="60"/>
-                    <w:bottom w:type="dxa" w:w="40"/>
-                    <w:right w:type="dxa" w:w="60"/>
-                  </w:tcMar>
-                </w:tcPr>
-                <w:p>
-                  <w:pPr>
-                    <w:spacing w:after="0"/>
-                  </w:pPr>
-                  <w:r>
-                    <w:rPr>
-                      <w:sz w:val="13"/>
-                      <w:szCs w:val="13"/>
-                    </w:rPr>
-                    <w:t xml:space="preserve">PK qualquer</w:t>
-                  </w:r>
-                </w:p>
-              </w:tc>
-            </w:tr>
-            <w:tr>
-              <w:tc>
-                <w:tcPr>
-                  <w:tcW w:type="dxa" w:w="300"/>
-                  <w:tcBorders>
-                    <w:top w:val="single" w:color="AAAAAA" w:sz="4"/>
-                    <w:left w:val="single" w:color="AAAAAA" w:sz="4"/>
-                    <w:bottom w:val="single" w:color="AAAAAA" w:sz="4"/>
-                    <w:right w:val="single" w:color="AAAAAA" w:sz="4"/>
-                  </w:tcBorders>
-                  <w:tcMar>
-                    <w:top w:type="dxa" w:w="40"/>
-                    <w:left w:type="dxa" w:w="60"/>
-                    <w:bottom w:type="dxa" w:w="40"/>
-                    <w:right w:type="dxa" w:w="60"/>
-                  </w:tcMar>
-                </w:tcPr>
-                <w:p>
-                  <w:pPr>
-                    <w:spacing w:after="0"/>
-                  </w:pPr>
-                  <w:r>
-                    <w:rPr>
-                      <w:sz w:val="13"/>
-                      <w:szCs w:val="13"/>
-                    </w:rPr>
-                    <w:t xml:space="preserve">2</w:t>
-                  </w:r>
-                </w:p>
-              </w:tc>
-              <w:tc>
-                <w:tcPr>
-                  <w:tcW w:type="dxa" w:w="1200"/>
-                  <w:tcBorders>
-                    <w:top w:val="single" w:color="AAAAAA" w:sz="4"/>
-                    <w:left w:val="single" w:color="AAAAAA" w:sz="4"/>
-                    <w:bottom w:val="single" w:color="AAAAAA" w:sz="4"/>
-                    <w:right w:val="single" w:color="AAAAAA" w:sz="4"/>
-                  </w:tcBorders>
-                  <w:tcMar>
-                    <w:top w:type="dxa" w:w="40"/>
-                    <w:left w:type="dxa" w:w="60"/>
-                    <w:bottom w:type="dxa" w:w="40"/>
-                    <w:right w:type="dxa" w:w="60"/>
-                  </w:tcMar>
-                </w:tcPr>
-                <w:p>
-                  <w:pPr>
-                    <w:spacing w:after="0"/>
-                  </w:pPr>
-                  <w:r>
-                    <w:rPr>
-                      <w:sz w:val="13"/>
-                      <w:szCs w:val="13"/>
-                    </w:rPr>
-                    <w:t xml:space="preserve">1:1</w:t>
-                  </w:r>
-                </w:p>
-              </w:tc>
-              <w:tc>
-                <w:tcPr>
-                  <w:tcW w:type="dxa" w:w="1900"/>
-                  <w:tcBorders>
-                    <w:top w:val="single" w:color="AAAAAA" w:sz="4"/>
-                    <w:left w:val="single" w:color="AAAAAA" w:sz="4"/>
-                    <w:bottom w:val="single" w:color="AAAAAA" w:sz="4"/>
-                    <w:right w:val="single" w:color="AAAAAA" w:sz="4"/>
-                  </w:tcBorders>
-                  <w:tcMar>
-                    <w:top w:type="dxa" w:w="40"/>
-                    <w:left w:type="dxa" w:w="60"/>
-                    <w:bottom w:type="dxa" w:w="40"/>
-                    <w:right w:type="dxa" w:w="60"/>
-                  </w:tcMar>
-                </w:tcPr>
-                <w:p>
-                  <w:pPr>
-                    <w:spacing w:after="0"/>
-                  </w:pPr>
-                  <w:r>
-                    <w:rPr>
-                      <w:sz w:val="13"/>
-                      <w:szCs w:val="13"/>
-                    </w:rPr>
-                    <w:t xml:space="preserve">Obrig. numa</w:t>
-                  </w:r>
-                </w:p>
-              </w:tc>
-              <w:tc>
-                <w:tcPr>
-                  <w:tcW w:type="dxa" w:w="900"/>
-                  <w:tcBorders>
-                    <w:top w:val="single" w:color="AAAAAA" w:sz="4"/>
-                    <w:left w:val="single" w:color="AAAAAA" w:sz="4"/>
-                    <w:bottom w:val="single" w:color="AAAAAA" w:sz="4"/>
-                    <w:right w:val="single" w:color="AAAAAA" w:sz="4"/>
-                  </w:tcBorders>
-                  <w:tcMar>
-                    <w:top w:type="dxa" w:w="40"/>
-                    <w:left w:type="dxa" w:w="60"/>
-                    <w:bottom w:type="dxa" w:w="40"/>
-                    <w:right w:type="dxa" w:w="60"/>
-                  </w:tcMar>
-                </w:tcPr>
-                <w:p>
-                  <w:pPr>
-                    <w:spacing w:after="0"/>
-                  </w:pPr>
-                  <w:r>
-                    <w:rPr>
-                      <w:sz w:val="13"/>
-                      <w:szCs w:val="13"/>
-                    </w:rPr>
-                    <w:t xml:space="preserve">2</w:t>
-                  </w:r>
-                </w:p>
-              </w:tc>
-              <w:tc>
-                <w:tcPr>
-                  <w:tcW w:type="dxa" w:w="2000"/>
-                  <w:tcBorders>
-                    <w:top w:val="single" w:color="AAAAAA" w:sz="4"/>
-                    <w:left w:val="single" w:color="AAAAAA" w:sz="4"/>
-                    <w:bottom w:val="single" w:color="AAAAAA" w:sz="4"/>
-                    <w:right w:val="single" w:color="AAAAAA" w:sz="4"/>
-                  </w:tcBorders>
-                  <w:tcMar>
-                    <w:top w:type="dxa" w:w="40"/>
-                    <w:left w:type="dxa" w:w="60"/>
-                    <w:bottom w:type="dxa" w:w="40"/>
-                    <w:right w:type="dxa" w:w="60"/>
-                  </w:tcMar>
-                </w:tcPr>
-                <w:p>
-                  <w:pPr>
-                    <w:spacing w:after="0"/>
-                  </w:pPr>
-                  <w:r>
-                    <w:rPr>
-                      <w:sz w:val="13"/>
-                      <w:szCs w:val="13"/>
-                    </w:rPr>
-                    <w:t xml:space="preserve">PK nao-obrig. → obrig.</w:t>
-                  </w:r>
-                </w:p>
-              </w:tc>
-            </w:tr>
-            <w:tr>
-              <w:tc>
-                <w:tcPr>
-                  <w:tcW w:type="dxa" w:w="300"/>
-                  <w:tcBorders>
-                    <w:top w:val="single" w:color="AAAAAA" w:sz="4"/>
-                    <w:left w:val="single" w:color="AAAAAA" w:sz="4"/>
-                    <w:bottom w:val="single" w:color="AAAAAA" w:sz="4"/>
-                    <w:right w:val="single" w:color="AAAAAA" w:sz="4"/>
-                  </w:tcBorders>
-                  <w:tcMar>
-                    <w:top w:type="dxa" w:w="40"/>
-                    <w:left w:type="dxa" w:w="60"/>
-                    <w:bottom w:type="dxa" w:w="40"/>
-                    <w:right w:type="dxa" w:w="60"/>
-                  </w:tcMar>
-                </w:tcPr>
-                <w:p>
-                  <w:pPr>
-                    <w:spacing w:after="0"/>
-                  </w:pPr>
-                  <w:r>
-                    <w:rPr>
-                      <w:sz w:val="13"/>
-                      <w:szCs w:val="13"/>
-                    </w:rPr>
-                    <w:t xml:space="preserve">3</w:t>
-                  </w:r>
-                </w:p>
-              </w:tc>
-              <w:tc>
-                <w:tcPr>
-                  <w:tcW w:type="dxa" w:w="1200"/>
-                  <w:tcBorders>
-                    <w:top w:val="single" w:color="AAAAAA" w:sz="4"/>
-                    <w:left w:val="single" w:color="AAAAAA" w:sz="4"/>
-                    <w:bottom w:val="single" w:color="AAAAAA" w:sz="4"/>
-                    <w:right w:val="single" w:color="AAAAAA" w:sz="4"/>
-                  </w:tcBorders>
-                  <w:tcMar>
-                    <w:top w:type="dxa" w:w="40"/>
-                    <w:left w:type="dxa" w:w="60"/>
-                    <w:bottom w:type="dxa" w:w="40"/>
-                    <w:right w:type="dxa" w:w="60"/>
-                  </w:tcMar>
-                </w:tcPr>
-                <w:p>
-                  <w:pPr>
-                    <w:spacing w:after="0"/>
-                  </w:pPr>
-                  <w:r>
-                    <w:rPr>
-                      <w:sz w:val="13"/>
-                      <w:szCs w:val="13"/>
-                    </w:rPr>
-                    <w:t xml:space="preserve">1:1</w:t>
-                  </w:r>
-                </w:p>
-              </w:tc>
-              <w:tc>
-                <w:tcPr>
-                  <w:tcW w:type="dxa" w:w="1900"/>
-                  <w:tcBorders>
-                    <w:top w:val="single" w:color="AAAAAA" w:sz="4"/>
-                    <w:left w:val="single" w:color="AAAAAA" w:sz="4"/>
-                    <w:bottom w:val="single" w:color="AAAAAA" w:sz="4"/>
-                    <w:right w:val="single" w:color="AAAAAA" w:sz="4"/>
-                  </w:tcBorders>
-                  <w:tcMar>
-                    <w:top w:type="dxa" w:w="40"/>
-                    <w:left w:type="dxa" w:w="60"/>
-                    <w:bottom w:type="dxa" w:w="40"/>
-                    <w:right w:type="dxa" w:w="60"/>
-                  </w:tcMar>
-                </w:tcPr>
-                <w:p>
-                  <w:pPr>
-                    <w:spacing w:after="0"/>
-                  </w:pPr>
-                  <w:r>
-                    <w:rPr>
-                      <w:sz w:val="13"/>
-                      <w:szCs w:val="13"/>
-                    </w:rPr>
-                    <w:t xml:space="preserve">Nenhuma obrig.</w:t>
-                  </w:r>
-                </w:p>
-              </w:tc>
-              <w:tc>
-                <w:tcPr>
-                  <w:tcW w:type="dxa" w:w="900"/>
-                  <w:tcBorders>
-                    <w:top w:val="single" w:color="AAAAAA" w:sz="4"/>
-                    <w:left w:val="single" w:color="AAAAAA" w:sz="4"/>
-                    <w:bottom w:val="single" w:color="AAAAAA" w:sz="4"/>
-                    <w:right w:val="single" w:color="AAAAAA" w:sz="4"/>
-                  </w:tcBorders>
-                  <w:tcMar>
-                    <w:top w:type="dxa" w:w="40"/>
-                    <w:left w:type="dxa" w:w="60"/>
-                    <w:bottom w:type="dxa" w:w="40"/>
-                    <w:right w:type="dxa" w:w="60"/>
-                  </w:tcMar>
-                </w:tcPr>
-                <w:p>
-                  <w:pPr>
-                    <w:spacing w:after="0"/>
-                  </w:pPr>
-                  <w:r>
-                    <w:rPr>
-                      <w:sz w:val="13"/>
-                      <w:szCs w:val="13"/>
-                    </w:rPr>
-                    <w:t xml:space="preserve">3</w:t>
-                  </w:r>
-                </w:p>
-              </w:tc>
-              <w:tc>
-                <w:tcPr>
-                  <w:tcW w:type="dxa" w:w="2000"/>
-                  <w:tcBorders>
-                    <w:top w:val="single" w:color="AAAAAA" w:sz="4"/>
-                    <w:left w:val="single" w:color="AAAAAA" w:sz="4"/>
-                    <w:bottom w:val="single" w:color="AAAAAA" w:sz="4"/>
-                    <w:right w:val="single" w:color="AAAAAA" w:sz="4"/>
-                  </w:tcBorders>
-                  <w:tcMar>
-                    <w:top w:type="dxa" w:w="40"/>
-                    <w:left w:type="dxa" w:w="60"/>
-                    <w:bottom w:type="dxa" w:w="40"/>
-                    <w:right w:type="dxa" w:w="60"/>
-                  </w:tcMar>
-                </w:tcPr>
-                <w:p>
-                  <w:pPr>
-                    <w:spacing w:after="0"/>
-                  </w:pPr>
-                  <w:r>
-                    <w:rPr>
-                      <w:sz w:val="13"/>
-                      <w:szCs w:val="13"/>
-                    </w:rPr>
-                    <w:t xml:space="preserve">Tabela de relacao</w:t>
-                  </w:r>
-                </w:p>
-              </w:tc>
-            </w:tr>
-            <w:tr>
-              <w:tc>
-                <w:tcPr>
-                  <w:tcW w:type="dxa" w:w="300"/>
-                  <w:tcBorders>
-                    <w:top w:val="single" w:color="AAAAAA" w:sz="4"/>
-                    <w:left w:val="single" w:color="AAAAAA" w:sz="4"/>
-                    <w:bottom w:val="single" w:color="AAAAAA" w:sz="4"/>
-                    <w:right w:val="single" w:color="AAAAAA" w:sz="4"/>
-                  </w:tcBorders>
-                  <w:tcMar>
-                    <w:top w:type="dxa" w:w="40"/>
-                    <w:left w:type="dxa" w:w="60"/>
-                    <w:bottom w:type="dxa" w:w="40"/>
-                    <w:right w:type="dxa" w:w="60"/>
-                  </w:tcMar>
-                </w:tcPr>
-                <w:p>
-                  <w:pPr>
-                    <w:spacing w:after="0"/>
-                  </w:pPr>
-                  <w:r>
-                    <w:rPr>
-                      <w:sz w:val="13"/>
-                      <w:szCs w:val="13"/>
-                    </w:rPr>
-                    <w:t xml:space="preserve">4</w:t>
-                  </w:r>
-                </w:p>
-              </w:tc>
-              <w:tc>
-                <w:tcPr>
-                  <w:tcW w:type="dxa" w:w="1200"/>
-                  <w:tcBorders>
-                    <w:top w:val="single" w:color="AAAAAA" w:sz="4"/>
-                    <w:left w:val="single" w:color="AAAAAA" w:sz="4"/>
-                    <w:bottom w:val="single" w:color="AAAAAA" w:sz="4"/>
-                    <w:right w:val="single" w:color="AAAAAA" w:sz="4"/>
-                  </w:tcBorders>
-                  <w:tcMar>
-                    <w:top w:type="dxa" w:w="40"/>
-                    <w:left w:type="dxa" w:w="60"/>
-                    <w:bottom w:type="dxa" w:w="40"/>
-                    <w:right w:type="dxa" w:w="60"/>
-                  </w:tcMar>
-                </w:tcPr>
-                <w:p>
-                  <w:pPr>
-                    <w:spacing w:after="0"/>
-                  </w:pPr>
-                  <w:r>
-                    <w:rPr>
-                      <w:sz w:val="13"/>
-                      <w:szCs w:val="13"/>
-                    </w:rPr>
-                    <w:t xml:space="preserve">1:N</w:t>
-                  </w:r>
-                </w:p>
-              </w:tc>
-              <w:tc>
-                <w:tcPr>
-                  <w:tcW w:type="dxa" w:w="1900"/>
-                  <w:tcBorders>
-                    <w:top w:val="single" w:color="AAAAAA" w:sz="4"/>
-                    <w:left w:val="single" w:color="AAAAAA" w:sz="4"/>
-                    <w:bottom w:val="single" w:color="AAAAAA" w:sz="4"/>
-                    <w:right w:val="single" w:color="AAAAAA" w:sz="4"/>
-                  </w:tcBorders>
-                  <w:tcMar>
-                    <w:top w:type="dxa" w:w="40"/>
-                    <w:left w:type="dxa" w:w="60"/>
-                    <w:bottom w:type="dxa" w:w="40"/>
-                    <w:right w:type="dxa" w:w="60"/>
-                  </w:tcMar>
-                </w:tcPr>
-                <w:p>
-                  <w:pPr>
-                    <w:spacing w:after="0"/>
-                  </w:pPr>
-                  <w:r>
-                    <w:rPr>
-                      <w:sz w:val="13"/>
-                      <w:szCs w:val="13"/>
-                    </w:rPr>
-                    <w:t xml:space="preserve">Obrig. lado N</w:t>
-                  </w:r>
-                </w:p>
-              </w:tc>
-              <w:tc>
-                <w:tcPr>
-                  <w:tcW w:type="dxa" w:w="900"/>
-                  <w:tcBorders>
-                    <w:top w:val="single" w:color="AAAAAA" w:sz="4"/>
-                    <w:left w:val="single" w:color="AAAAAA" w:sz="4"/>
-                    <w:bottom w:val="single" w:color="AAAAAA" w:sz="4"/>
-                    <w:right w:val="single" w:color="AAAAAA" w:sz="4"/>
-                  </w:tcBorders>
-                  <w:tcMar>
-                    <w:top w:type="dxa" w:w="40"/>
-                    <w:left w:type="dxa" w:w="60"/>
-                    <w:bottom w:type="dxa" w:w="40"/>
-                    <w:right w:type="dxa" w:w="60"/>
-                  </w:tcMar>
-                </w:tcPr>
-                <w:p>
-                  <w:pPr>
-                    <w:spacing w:after="0"/>
-                  </w:pPr>
-                  <w:r>
-                    <w:rPr>
-                      <w:sz w:val="13"/>
-                      <w:szCs w:val="13"/>
-                    </w:rPr>
-                    <w:t xml:space="preserve">2</w:t>
-                  </w:r>
-                </w:p>
-              </w:tc>
-              <w:tc>
-                <w:tcPr>
-                  <w:tcW w:type="dxa" w:w="2000"/>
-                  <w:tcBorders>
-                    <w:top w:val="single" w:color="AAAAAA" w:sz="4"/>
-                    <w:left w:val="single" w:color="AAAAAA" w:sz="4"/>
-                    <w:bottom w:val="single" w:color="AAAAAA" w:sz="4"/>
-                    <w:right w:val="single" w:color="AAAAAA" w:sz="4"/>
-                  </w:tcBorders>
-                  <w:tcMar>
-                    <w:top w:type="dxa" w:w="40"/>
-                    <w:left w:type="dxa" w:w="60"/>
-                    <w:bottom w:type="dxa" w:w="40"/>
-                    <w:right w:type="dxa" w:w="60"/>
-                  </w:tcMar>
-                </w:tcPr>
-                <w:p>
-                  <w:pPr>
-                    <w:spacing w:after="0"/>
-                  </w:pPr>
-                  <w:r>
-                    <w:rPr>
-                      <w:sz w:val="13"/>
-                      <w:szCs w:val="13"/>
-                    </w:rPr>
-                    <w:t xml:space="preserve">PK do lado 1 → no N</w:t>
-                  </w:r>
-                </w:p>
-              </w:tc>
-            </w:tr>
-            <w:tr>
-              <w:tc>
-                <w:tcPr>
-                  <w:tcW w:type="dxa" w:w="300"/>
-                  <w:tcBorders>
-                    <w:top w:val="single" w:color="AAAAAA" w:sz="4"/>
-                    <w:left w:val="single" w:color="AAAAAA" w:sz="4"/>
-                    <w:bottom w:val="single" w:color="AAAAAA" w:sz="4"/>
-                    <w:right w:val="single" w:color="AAAAAA" w:sz="4"/>
-                  </w:tcBorders>
-                  <w:tcMar>
-                    <w:top w:type="dxa" w:w="40"/>
-                    <w:left w:type="dxa" w:w="60"/>
-                    <w:bottom w:type="dxa" w:w="40"/>
-                    <w:right w:type="dxa" w:w="60"/>
-                  </w:tcMar>
-                </w:tcPr>
-                <w:p>
-                  <w:pPr>
-                    <w:spacing w:after="0"/>
-                  </w:pPr>
-                  <w:r>
-                    <w:rPr>
-                      <w:sz w:val="13"/>
-                      <w:szCs w:val="13"/>
-                    </w:rPr>
-                    <w:t xml:space="preserve">5</w:t>
-                  </w:r>
-                </w:p>
-              </w:tc>
-              <w:tc>
-                <w:tcPr>
-                  <w:tcW w:type="dxa" w:w="1200"/>
-                  <w:tcBorders>
-                    <w:top w:val="single" w:color="AAAAAA" w:sz="4"/>
-                    <w:left w:val="single" w:color="AAAAAA" w:sz="4"/>
-                    <w:bottom w:val="single" w:color="AAAAAA" w:sz="4"/>
-                    <w:right w:val="single" w:color="AAAAAA" w:sz="4"/>
-                  </w:tcBorders>
-                  <w:tcMar>
-                    <w:top w:type="dxa" w:w="40"/>
-                    <w:left w:type="dxa" w:w="60"/>
-                    <w:bottom w:type="dxa" w:w="40"/>
-                    <w:right w:type="dxa" w:w="60"/>
-                  </w:tcMar>
-                </w:tcPr>
-                <w:p>
-                  <w:pPr>
-                    <w:spacing w:after="0"/>
-                  </w:pPr>
-                  <w:r>
-                    <w:rPr>
-                      <w:sz w:val="13"/>
-                      <w:szCs w:val="13"/>
-                    </w:rPr>
-                    <w:t xml:space="preserve">1:N</w:t>
-                  </w:r>
-                </w:p>
-              </w:tc>
-              <w:tc>
-                <w:tcPr>
-                  <w:tcW w:type="dxa" w:w="1900"/>
-                  <w:tcBorders>
-                    <w:top w:val="single" w:color="AAAAAA" w:sz="4"/>
-                    <w:left w:val="single" w:color="AAAAAA" w:sz="4"/>
-                    <w:bottom w:val="single" w:color="AAAAAA" w:sz="4"/>
-                    <w:right w:val="single" w:color="AAAAAA" w:sz="4"/>
-                  </w:tcBorders>
-                  <w:tcMar>
-                    <w:top w:type="dxa" w:w="40"/>
-                    <w:left w:type="dxa" w:w="60"/>
-                    <w:bottom w:type="dxa" w:w="40"/>
-                    <w:right w:type="dxa" w:w="60"/>
-                  </w:tcMar>
-                </w:tcPr>
-                <w:p>
-                  <w:pPr>
-                    <w:spacing w:after="0"/>
-                  </w:pPr>
-                  <w:r>
-                    <w:rPr>
-                      <w:sz w:val="13"/>
-                      <w:szCs w:val="13"/>
-                    </w:rPr>
-                    <w:t xml:space="preserve">Nao obrig. N</w:t>
-                  </w:r>
-                </w:p>
-              </w:tc>
-              <w:tc>
-                <w:tcPr>
-                  <w:tcW w:type="dxa" w:w="900"/>
-                  <w:tcBorders>
-                    <w:top w:val="single" w:color="AAAAAA" w:sz="4"/>
-                    <w:left w:val="single" w:color="AAAAAA" w:sz="4"/>
-                    <w:bottom w:val="single" w:color="AAAAAA" w:sz="4"/>
-                    <w:right w:val="single" w:color="AAAAAA" w:sz="4"/>
-                  </w:tcBorders>
-                  <w:tcMar>
-                    <w:top w:type="dxa" w:w="40"/>
-                    <w:left w:type="dxa" w:w="60"/>
-                    <w:bottom w:type="dxa" w:w="40"/>
-                    <w:right w:type="dxa" w:w="60"/>
-                  </w:tcMar>
-                </w:tcPr>
-                <w:p>
-                  <w:pPr>
-                    <w:spacing w:after="0"/>
-                  </w:pPr>
-                  <w:r>
-                    <w:rPr>
-                      <w:sz w:val="13"/>
-                      <w:szCs w:val="13"/>
-                    </w:rPr>
-                    <w:t xml:space="preserve">3</w:t>
-                  </w:r>
-                </w:p>
-              </w:tc>
-              <w:tc>
-                <w:tcPr>
-                  <w:tcW w:type="dxa" w:w="2000"/>
-                  <w:tcBorders>
-                    <w:top w:val="single" w:color="AAAAAA" w:sz="4"/>
-                    <w:left w:val="single" w:color="AAAAAA" w:sz="4"/>
-                    <w:bottom w:val="single" w:color="AAAAAA" w:sz="4"/>
-                    <w:right w:val="single" w:color="AAAAAA" w:sz="4"/>
-                  </w:tcBorders>
-                  <w:tcMar>
-                    <w:top w:type="dxa" w:w="40"/>
-                    <w:left w:type="dxa" w:w="60"/>
-                    <w:bottom w:type="dxa" w:w="40"/>
-                    <w:right w:type="dxa" w:w="60"/>
-                  </w:tcMar>
-                </w:tcPr>
-                <w:p>
-                  <w:pPr>
-                    <w:spacing w:after="0"/>
-                  </w:pPr>
-                  <w:r>
-                    <w:rPr>
-                      <w:sz w:val="13"/>
-                      <w:szCs w:val="13"/>
-                    </w:rPr>
-                    <w:t xml:space="preserve">Tabela de relacao</w:t>
-                  </w:r>
-                </w:p>
-              </w:tc>
-            </w:tr>
-            <w:tr>
-              <w:tc>
-                <w:tcPr>
-                  <w:tcW w:type="dxa" w:w="300"/>
-                  <w:tcBorders>
-                    <w:top w:val="single" w:color="AAAAAA" w:sz="4"/>
-                    <w:left w:val="single" w:color="AAAAAA" w:sz="4"/>
-                    <w:bottom w:val="single" w:color="AAAAAA" w:sz="4"/>
-                    <w:right w:val="single" w:color="AAAAAA" w:sz="4"/>
-                  </w:tcBorders>
-                  <w:tcMar>
-                    <w:top w:type="dxa" w:w="40"/>
-                    <w:left w:type="dxa" w:w="60"/>
-                    <w:bottom w:type="dxa" w:w="40"/>
-                    <w:right w:type="dxa" w:w="60"/>
-                  </w:tcMar>
-                </w:tcPr>
-                <w:p>
-                  <w:pPr>
-                    <w:spacing w:after="0"/>
-                  </w:pPr>
-                  <w:r>
-                    <w:rPr>
-                      <w:sz w:val="13"/>
-                      <w:szCs w:val="13"/>
-                    </w:rPr>
-                    <w:t xml:space="preserve">6</w:t>
-                  </w:r>
-                </w:p>
-              </w:tc>
-              <w:tc>
-                <w:tcPr>
-                  <w:tcW w:type="dxa" w:w="1200"/>
-                  <w:tcBorders>
-                    <w:top w:val="single" w:color="AAAAAA" w:sz="4"/>
-                    <w:left w:val="single" w:color="AAAAAA" w:sz="4"/>
-                    <w:bottom w:val="single" w:color="AAAAAA" w:sz="4"/>
-                    <w:right w:val="single" w:color="AAAAAA" w:sz="4"/>
-                  </w:tcBorders>
-                  <w:tcMar>
-                    <w:top w:type="dxa" w:w="40"/>
-                    <w:left w:type="dxa" w:w="60"/>
-                    <w:bottom w:type="dxa" w:w="40"/>
-                    <w:right w:type="dxa" w:w="60"/>
-                  </w:tcMar>
-                </w:tcPr>
-                <w:p>
-                  <w:pPr>
-                    <w:spacing w:after="0"/>
-                  </w:pPr>
-                  <w:r>
-                    <w:rPr>
-                      <w:sz w:val="13"/>
-                      <w:szCs w:val="13"/>
-                    </w:rPr>
-                    <w:t xml:space="preserve">M:N</w:t>
-                  </w:r>
-                </w:p>
-              </w:tc>
-              <w:tc>
-                <w:tcPr>
-                  <w:tcW w:type="dxa" w:w="1900"/>
-                  <w:tcBorders>
-                    <w:top w:val="single" w:color="AAAAAA" w:sz="4"/>
-                    <w:left w:val="single" w:color="AAAAAA" w:sz="4"/>
-                    <w:bottom w:val="single" w:color="AAAAAA" w:sz="4"/>
-                    <w:right w:val="single" w:color="AAAAAA" w:sz="4"/>
-                  </w:tcBorders>
-                  <w:tcMar>
-                    <w:top w:type="dxa" w:w="40"/>
-                    <w:left w:type="dxa" w:w="60"/>
-                    <w:bottom w:type="dxa" w:w="40"/>
-                    <w:right w:type="dxa" w:w="60"/>
-                  </w:tcMar>
-                </w:tcPr>
-                <w:p>
-                  <w:pPr>
-                    <w:spacing w:after="0"/>
-                  </w:pPr>
-                  <w:r>
-                    <w:rPr>
-                      <w:sz w:val="13"/>
-                      <w:szCs w:val="13"/>
-                    </w:rPr>
-                    <w:t xml:space="preserve">Indiferente</w:t>
-                  </w:r>
-                </w:p>
-              </w:tc>
-              <w:tc>
-                <w:tcPr>
-                  <w:tcW w:type="dxa" w:w="900"/>
-                  <w:tcBorders>
-                    <w:top w:val="single" w:color="AAAAAA" w:sz="4"/>
-                    <w:left w:val="single" w:color="AAAAAA" w:sz="4"/>
-                    <w:bottom w:val="single" w:color="AAAAAA" w:sz="4"/>
-                    <w:right w:val="single" w:color="AAAAAA" w:sz="4"/>
-                  </w:tcBorders>
-                  <w:tcMar>
-                    <w:top w:type="dxa" w:w="40"/>
-                    <w:left w:type="dxa" w:w="60"/>
-                    <w:bottom w:type="dxa" w:w="40"/>
-                    <w:right w:type="dxa" w:w="60"/>
-                  </w:tcMar>
-                </w:tcPr>
-                <w:p>
-                  <w:pPr>
-                    <w:spacing w:after="0"/>
-                  </w:pPr>
-                  <w:r>
-                    <w:rPr>
-                      <w:sz w:val="13"/>
-                      <w:szCs w:val="13"/>
-                    </w:rPr>
-                    <w:t xml:space="preserve">3</w:t>
-                  </w:r>
-                </w:p>
-              </w:tc>
-              <w:tc>
-                <w:tcPr>
-                  <w:tcW w:type="dxa" w:w="2000"/>
-                  <w:tcBorders>
-                    <w:top w:val="single" w:color="AAAAAA" w:sz="4"/>
-                    <w:left w:val="single" w:color="AAAAAA" w:sz="4"/>
-                    <w:bottom w:val="single" w:color="AAAAAA" w:sz="4"/>
-                    <w:right w:val="single" w:color="AAAAAA" w:sz="4"/>
-                  </w:tcBorders>
-                  <w:tcMar>
-                    <w:top w:type="dxa" w:w="40"/>
-                    <w:left w:type="dxa" w:w="60"/>
-                    <w:bottom w:type="dxa" w:w="40"/>
-                    <w:right w:type="dxa" w:w="60"/>
-                  </w:tcMar>
-                </w:tcPr>
-                <w:p>
-                  <w:pPr>
-                    <w:spacing w:after="0"/>
-                  </w:pPr>
-                  <w:r>
-                    <w:rPr>
-                      <w:sz w:val="13"/>
-                      <w:szCs w:val="13"/>
-                    </w:rPr>
-                    <w:t xml:space="preserve">Tabela assoc. com ambas</w:t>
-                  </w:r>
-                </w:p>
-              </w:tc>
-            </w:tr>
-            <w:tr>
-              <w:tc>
-                <w:tcPr>
-                  <w:tcW w:type="dxa" w:w="300"/>
-                  <w:tcBorders>
-                    <w:top w:val="single" w:color="AAAAAA" w:sz="4"/>
-                    <w:left w:val="single" w:color="AAAAAA" w:sz="4"/>
-                    <w:bottom w:val="single" w:color="AAAAAA" w:sz="4"/>
-                    <w:right w:val="single" w:color="AAAAAA" w:sz="4"/>
-                  </w:tcBorders>
-                  <w:tcMar>
-                    <w:top w:type="dxa" w:w="40"/>
-                    <w:left w:type="dxa" w:w="60"/>
-                    <w:bottom w:type="dxa" w:w="40"/>
-                    <w:right w:type="dxa" w:w="60"/>
-                  </w:tcMar>
-                </w:tcPr>
-                <w:p>
-                  <w:pPr>
-                    <w:spacing w:after="0"/>
-                  </w:pPr>
-                  <w:r>
-                    <w:rPr>
-                      <w:sz w:val="13"/>
-                      <w:szCs w:val="13"/>
-                    </w:rPr>
-                    <w:t xml:space="preserve">7</w:t>
-                  </w:r>
-                </w:p>
-              </w:tc>
-              <w:tc>
-                <w:tcPr>
-                  <w:tcW w:type="dxa" w:w="1200"/>
-                  <w:tcBorders>
-                    <w:top w:val="single" w:color="AAAAAA" w:sz="4"/>
-                    <w:left w:val="single" w:color="AAAAAA" w:sz="4"/>
-                    <w:bottom w:val="single" w:color="AAAAAA" w:sz="4"/>
-                    <w:right w:val="single" w:color="AAAAAA" w:sz="4"/>
-                  </w:tcBorders>
-                  <w:tcMar>
-                    <w:top w:type="dxa" w:w="40"/>
-                    <w:left w:type="dxa" w:w="60"/>
-                    <w:bottom w:type="dxa" w:w="40"/>
-                    <w:right w:type="dxa" w:w="60"/>
-                  </w:tcMar>
-                </w:tcPr>
-                <w:p>
-                  <w:pPr>
-                    <w:spacing w:after="0"/>
-                  </w:pPr>
-                  <w:r>
-                    <w:rPr>
-                      <w:sz w:val="13"/>
-                      <w:szCs w:val="13"/>
-                    </w:rPr>
-                    <w:t xml:space="preserve">Ternaria</w:t>
-                  </w:r>
-                </w:p>
-              </w:tc>
-              <w:tc>
-                <w:tcPr>
-                  <w:tcW w:type="dxa" w:w="1900"/>
-                  <w:tcBorders>
-                    <w:top w:val="single" w:color="AAAAAA" w:sz="4"/>
-                    <w:left w:val="single" w:color="AAAAAA" w:sz="4"/>
-                    <w:bottom w:val="single" w:color="AAAAAA" w:sz="4"/>
-                    <w:right w:val="single" w:color="AAAAAA" w:sz="4"/>
-                  </w:tcBorders>
-                  <w:tcMar>
-                    <w:top w:type="dxa" w:w="40"/>
-                    <w:left w:type="dxa" w:w="60"/>
-                    <w:bottom w:type="dxa" w:w="40"/>
-                    <w:right w:type="dxa" w:w="60"/>
-                  </w:tcMar>
-                </w:tcPr>
-                <w:p>
-                  <w:pPr>
-                    <w:spacing w:after="0"/>
-                  </w:pPr>
-                  <w:r>
-                    <w:rPr>
-                      <w:sz w:val="13"/>
-                      <w:szCs w:val="13"/>
-                    </w:rPr>
-                    <w:t xml:space="preserve">Indiferente</w:t>
-                  </w:r>
-                </w:p>
-              </w:tc>
-              <w:tc>
-                <w:tcPr>
-                  <w:tcW w:type="dxa" w:w="900"/>
-                  <w:tcBorders>
-                    <w:top w:val="single" w:color="AAAAAA" w:sz="4"/>
-                    <w:left w:val="single" w:color="AAAAAA" w:sz="4"/>
-                    <w:bottom w:val="single" w:color="AAAAAA" w:sz="4"/>
-                    <w:right w:val="single" w:color="AAAAAA" w:sz="4"/>
-                  </w:tcBorders>
-                  <w:tcMar>
-                    <w:top w:type="dxa" w:w="40"/>
-                    <w:left w:type="dxa" w:w="60"/>
-                    <w:bottom w:type="dxa" w:w="40"/>
-                    <w:right w:type="dxa" w:w="60"/>
-                  </w:tcMar>
-                </w:tcPr>
-                <w:p>
-                  <w:pPr>
-                    <w:spacing w:after="0"/>
-                  </w:pPr>
-                  <w:r>
-                    <w:rPr>
-                      <w:sz w:val="13"/>
-                      <w:szCs w:val="13"/>
-                    </w:rPr>
-                    <w:t xml:space="preserve">4</w:t>
-                  </w:r>
-                </w:p>
-              </w:tc>
-              <w:tc>
-                <w:tcPr>
-                  <w:tcW w:type="dxa" w:w="2000"/>
-                  <w:tcBorders>
-                    <w:top w:val="single" w:color="AAAAAA" w:sz="4"/>
-                    <w:left w:val="single" w:color="AAAAAA" w:sz="4"/>
-                    <w:bottom w:val="single" w:color="AAAAAA" w:sz="4"/>
-                    <w:right w:val="single" w:color="AAAAAA" w:sz="4"/>
-                  </w:tcBorders>
-                  <w:tcMar>
-                    <w:top w:type="dxa" w:w="40"/>
-                    <w:left w:type="dxa" w:w="60"/>
-                    <w:bottom w:type="dxa" w:w="40"/>
-                    <w:right w:type="dxa" w:w="60"/>
-                  </w:tcMar>
-                </w:tcPr>
-                <w:p>
-                  <w:pPr>
-                    <w:spacing w:after="0"/>
-                  </w:pPr>
-                  <w:r>
-                    <w:rPr>
-                      <w:sz w:val="13"/>
-                      <w:szCs w:val="13"/>
-                    </w:rPr>
-                    <w:t xml:space="preserve">Tabela com todas PKs</w:t>
-                  </w:r>
-                </w:p>
-              </w:tc>
-            </w:tr>
-          </w:tbl>
-          <w:p>
-            <w:pPr>
-              <w:spacing w:after="80"/>
-            </w:pPr>
-            <w:r>
-              <w:t xml:space="preserve"/>
-            </w:r>
-          </w:p>
-          <w:p>
-            <w:pPr>
-              <w:shd w:fill="1F3864" w:val="clear"/>
-              <w:spacing w:after="60" w:before="60"/>
-            </w:pPr>
-            <w:r>
-              <w:rPr>
-                <w:b/>
-                <w:bCs/>
-                <w:color w:val="FFFFFF"/>
-                <w:sz w:val="18"/>
-                <w:szCs w:val="18"/>
-              </w:rPr>
-              <w:t xml:space="preserve">  8. Tipos de Dados Comuns (Fase 9)</w:t>
+              <w:t xml:space="preserve">  7. Tipos de Dados Comuns (Fase 9)</w:t>
             </w:r>
           </w:p>
           <w:tbl>

</xml_diff>